<commit_message>
Update handover docs: CI, walkthrough format, less repetition
- Overview: the Cloudflare concern is explained once (Section 7.1);
  Section 5 and 6 point to it instead of repeating it. Configuration
  (secrets, REDCap project requirements) moves to the walkthrough.
  CI is listed in the tech stack and dropped from the open items.
  Figure 8 arrow and box labels say what happens in plain words.
- Walkthrough: reformatted to match the PATH GitHub walkthrough
  (manual style), with the fork screenshot, enabling Actions in a
  new fork and requiring the CI check before merging, WTS rates from
  the WTS Virtual Server Hosting page, and the moved configuration.
- README: CI runs lint, tests and build on every push and PR.

Co-Authored-By: Claude Opus 5.5 <noreply@anthropic.com>
Claude-Session: https://claude.ai/code/session_01WvzECS9tkcDkGpWoZeB54Z
</commit_message>
<xml_diff>
--- a/docs/CTS_Design_Workflow_Overview.docx
+++ b/docs/CTS_Design_Workflow_Overview.docx
@@ -56,7 +56,7 @@
       </w:pPr>
       <w:r>
         <w:rPr/>
-        <w:t xml:space="preserve">Sections 1–7 describe the application, the REDCap design and the open ethics (REB) item, and are intended for anyone involved in the project, including the Principal Investigator (PI). Sections 8–9 are aimed at the person maintaining the code. Getting access to the code, the development workflow, hosting and REDCap setup are covered in the companion CTS GitHub &amp; Server Setup walkthrough; this document assumes that setup is done.</w:t>
+        <w:t xml:space="preserve">Sections 1–7 describe the application, the REDCap design and the open ethics (REB) item, and are intended for anyone involved in the project, including the Principal Investigator (PI). Sections 8–9 are aimed at the person maintaining the code. Getting access to the code, the development workflow, hosting and REDCap setup are covered in the companion CTS GitHub &amp; Server Setup Walkthrough; this document assumes that setup is done.</w:t>
       </w:r>
     </w:p>
     <w:p>
@@ -656,7 +656,7 @@
       </w:r>
       <w:r>
         <w:rPr/>
-        <w:t xml:space="preserve"> branch holds the REDCap integration described in Section 5. The successor is expected to fork it into their own account or lab organization (see the walkthrough, Section 1) and continue the work there.</w:t>
+        <w:t xml:space="preserve"> branch holds the REDCap integration described in Section 5. The successor is expected to fork it into their own account or lab organization (see the Walkthrough, Section 1) and continue the work there.</w:t>
       </w:r>
     </w:p>
     <w:p>
@@ -676,7 +676,7 @@
       </w:r>
       <w:r>
         <w:rPr/>
-        <w:t xml:space="preserve"> the current demo is hosted on Jamie Kim's Cloudflare Pages account. Given the REB concern in Section 7, study data should not go through Cloudflare. The walkthrough, Section 3, drafts how the app would be hosted on a Western-managed (WTS) server instead.</w:t>
+        <w:t xml:space="preserve"> the current demo is hosted on Jamie Kim's Cloudflare Pages account. Given the REB concern in Section 7, study data should not go through Cloudflare. The Walkthrough, Section 3, drafts how the app would be hosted on a Western-managed (WTS) server instead.</w:t>
       </w:r>
     </w:p>
     <w:p>
@@ -6205,27 +6205,17 @@
       </w:pPr>
       <w:r>
         <w:rPr/>
-        <w:t xml:space="preserve">The original design keeps the website as a static front end on </w:t>
+        <w:t xml:space="preserve">The website stays a static front end, and the study's data is stored in </w:t>
       </w:r>
       <w:r>
         <w:rPr>
           <w:b/>
         </w:rPr>
-        <w:t xml:space="preserve">Cloudflare Pages</w:t>
-      </w:r>
-      <w:r>
-        <w:rPr/>
-        <w:t xml:space="preserve"> and stores data in the study's </w:t>
-      </w:r>
-      <w:r>
-        <w:rPr>
-          <w:b/>
-        </w:rPr>
         <w:t xml:space="preserve">REDCap</w:t>
       </w:r>
       <w:r>
         <w:rPr/>
-        <w:t xml:space="preserve"> project. Because a static site cannot hold the REDCap API token safely, three small server functions (Cloudflare Pages Functions) sit between the browser and REDCap. They hold the token, look up participants and forward submissions.</w:t>
+        <w:t xml:space="preserve">. A static site cannot hold the REDCap API token safely, so three small server functions sit between the browser and REDCap: they hold the token, look up participants and forward submissions. In the original design these run as Cloudflare Pages Functions, which is why the design must change before study use (Section 7). The server secrets and REDCap project setup the integration needs are listed in the Walkthrough, Section 4.2.</w:t>
       </w:r>
     </w:p>
     <w:p>
@@ -6296,15 +6286,6 @@
     </w:p>
     <w:p>
       <w:pPr>
-        <w:spacing w:after="120"/>
-      </w:pPr>
-      <w:r>
-        <w:rPr/>
-        <w:t xml:space="preserve">The REDCap side stays in Canada, but every call to it, including each participant's submission, is relayed through Cloudflare (highlighted). That relay is the REB concern in Section 7.</w:t>
-      </w:r>
-    </w:p>
-    <w:p>
-      <w:pPr>
         <w:pStyle w:val="Heading2"/>
         <w:keepNext/>
         <w:keepLines/>
@@ -6587,7 +6568,7 @@
       </w:r>
       <w:r>
         <w:rPr/>
-        <w:t xml:space="preserve"> on the study's REDCap project: reopening a submitted baseline link shows "Baseline assessment already submitted". To reopen a timepoint for a redo, a coordinator clears that event's </w:t>
+        <w:t xml:space="preserve"> on the study's REDCap project: reopening a submitted baseline link shows "Baseline assessment already submitted". The </w:t>
       </w:r>
       <w:r>
         <w:rPr>
@@ -6600,7 +6581,20 @@
       </w:r>
       <w:r>
         <w:rPr/>
-        <w:t xml:space="preserve"> field (possible with data entry rights). The setup and verification steps are in the walkthrough, Section 4.</w:t>
+        <w:t xml:space="preserve"> (time completed) field is filled when the answers are submitted on reaching the Results page, not when the link is opened, so a participant who opens a link and leaves without finishing can come back later. To let a participant redo a timepoint, a coordinator clears that event's </w:t>
+      </w:r>
+      <w:r>
+        <w:rPr>
+          <w:rFonts w:ascii="Consolas" w:hAnsi="Consolas" w:cs="Consolas"/>
+          <w:color w:val="333333"/>
+          <w:sz w:val="19"/>
+          <w:szCs w:val="19"/>
+        </w:rPr>
+        <w:t xml:space="preserve">timestamp</w:t>
+      </w:r>
+      <w:r>
+        <w:rPr/>
+        <w:t xml:space="preserve"> (possible with data entry rights); see the Walkthrough, Section 4.4.</w:t>
       </w:r>
     </w:p>
     <w:p>
@@ -6874,659 +6868,7 @@
         <w:keepLines/>
       </w:pPr>
       <w:r>
-        <w:t>5.3 Configuration</w:t>
-      </w:r>
-    </w:p>
-    <w:tbl>
-      <w:tblPr>
-        <w:tblW w:w="9360" w:type="dxa"/>
-        <w:tblLayout w:type="fixed"/>
-      </w:tblPr>
-      <w:tblGrid>
-        <w:gridCol w:w="3324"/>
-        <w:gridCol w:w="6035"/>
-      </w:tblGrid>
-      <w:tr>
-        <w:trPr>
-          <w:tblHeader/>
-        </w:trPr>
-        <w:tc>
-          <w:tcPr>
-            <w:tcW w:type="dxa" w:w="3324"/>
-            <w:tcW w:w="3324" w:type="dxa"/>
-            <w:tcBorders>
-              <w:top w:val="single" w:color="C9D3DD" w:sz="4" w:space="0"/>
-              <w:left w:val="single" w:color="C9D3DD" w:sz="4" w:space="0"/>
-              <w:bottom w:val="single" w:color="C9D3DD" w:sz="4" w:space="0"/>
-              <w:right w:val="single" w:color="C9D3DD" w:sz="4" w:space="0"/>
-            </w:tcBorders>
-            <w:shd w:val="clear" w:color="auto" w:fill="1F3A5F"/>
-            <w:tcMar>
-              <w:top w:w="60" w:type="dxa"/>
-              <w:left w:w="100" w:type="dxa"/>
-              <w:bottom w:w="60" w:type="dxa"/>
-              <w:right w:w="100" w:type="dxa"/>
-            </w:tcMar>
-          </w:tcPr>
-          <w:p>
-            <w:r>
-              <w:rPr>
-                <w:b/>
-                <w:sz w:val="20"/>
-                <w:szCs w:val="20"/>
-                <w:color w:val="FFFFFF"/>
-              </w:rPr>
-              <w:t xml:space="preserve">Secret / variable</w:t>
-            </w:r>
-          </w:p>
-        </w:tc>
-        <w:tc>
-          <w:tcPr>
-            <w:tcW w:type="dxa" w:w="6035"/>
-            <w:tcW w:w="6035" w:type="dxa"/>
-            <w:tcBorders>
-              <w:top w:val="single" w:color="C9D3DD" w:sz="4" w:space="0"/>
-              <w:left w:val="single" w:color="C9D3DD" w:sz="4" w:space="0"/>
-              <w:bottom w:val="single" w:color="C9D3DD" w:sz="4" w:space="0"/>
-              <w:right w:val="single" w:color="C9D3DD" w:sz="4" w:space="0"/>
-            </w:tcBorders>
-            <w:shd w:val="clear" w:color="auto" w:fill="1F3A5F"/>
-            <w:tcMar>
-              <w:top w:w="60" w:type="dxa"/>
-              <w:left w:w="100" w:type="dxa"/>
-              <w:bottom w:w="60" w:type="dxa"/>
-              <w:right w:w="100" w:type="dxa"/>
-            </w:tcMar>
-          </w:tcPr>
-          <w:p>
-            <w:r>
-              <w:rPr>
-                <w:b/>
-                <w:sz w:val="20"/>
-                <w:szCs w:val="20"/>
-                <w:color w:val="FFFFFF"/>
-              </w:rPr>
-              <w:t xml:space="preserve">Purpose</w:t>
-            </w:r>
-          </w:p>
-        </w:tc>
-      </w:tr>
-      <w:tr>
-        <w:trPr>
-          <w:cantSplit/>
-        </w:trPr>
-        <w:tc>
-          <w:tcPr>
-            <w:tcW w:type="dxa" w:w="3324"/>
-            <w:tcW w:w="3324" w:type="dxa"/>
-            <w:tcBorders>
-              <w:top w:val="single" w:color="C9D3DD" w:sz="4" w:space="0"/>
-              <w:left w:val="single" w:color="C9D3DD" w:sz="4" w:space="0"/>
-              <w:bottom w:val="single" w:color="C9D3DD" w:sz="4" w:space="0"/>
-              <w:right w:val="single" w:color="C9D3DD" w:sz="4" w:space="0"/>
-            </w:tcBorders>
-            <w:shd w:val="clear" w:color="auto" w:fill="FFFFFF"/>
-            <w:tcMar>
-              <w:top w:w="60" w:type="dxa"/>
-              <w:left w:w="100" w:type="dxa"/>
-              <w:bottom w:w="60" w:type="dxa"/>
-              <w:right w:w="100" w:type="dxa"/>
-            </w:tcMar>
-          </w:tcPr>
-          <w:p>
-            <w:r>
-              <w:rPr>
-                <w:rFonts w:ascii="Consolas" w:hAnsi="Consolas" w:cs="Consolas"/>
-                <w:color w:val="333333"/>
-                <w:sz w:val="19"/>
-                <w:szCs w:val="19"/>
-              </w:rPr>
-              <w:t xml:space="preserve">REDCAP_API_URL</w:t>
-            </w:r>
-          </w:p>
-        </w:tc>
-        <w:tc>
-          <w:tcPr>
-            <w:tcW w:type="dxa" w:w="6035"/>
-            <w:tcW w:w="6035" w:type="dxa"/>
-            <w:tcBorders>
-              <w:top w:val="single" w:color="C9D3DD" w:sz="4" w:space="0"/>
-              <w:left w:val="single" w:color="C9D3DD" w:sz="4" w:space="0"/>
-              <w:bottom w:val="single" w:color="C9D3DD" w:sz="4" w:space="0"/>
-              <w:right w:val="single" w:color="C9D3DD" w:sz="4" w:space="0"/>
-            </w:tcBorders>
-            <w:shd w:val="clear" w:color="auto" w:fill="FFFFFF"/>
-            <w:tcMar>
-              <w:top w:w="60" w:type="dxa"/>
-              <w:left w:w="100" w:type="dxa"/>
-              <w:bottom w:w="60" w:type="dxa"/>
-              <w:right w:w="100" w:type="dxa"/>
-            </w:tcMar>
-          </w:tcPr>
-          <w:p>
-            <w:r>
-              <w:rPr>
-                <w:sz w:val="20"/>
-                <w:szCs w:val="20"/>
-              </w:rPr>
-              <w:t xml:space="preserve">Western REDCap API endpoint</w:t>
-            </w:r>
-          </w:p>
-        </w:tc>
-      </w:tr>
-      <w:tr>
-        <w:trPr>
-          <w:cantSplit/>
-        </w:trPr>
-        <w:tc>
-          <w:tcPr>
-            <w:tcW w:type="dxa" w:w="3324"/>
-            <w:tcW w:w="3324" w:type="dxa"/>
-            <w:tcBorders>
-              <w:top w:val="single" w:color="C9D3DD" w:sz="4" w:space="0"/>
-              <w:left w:val="single" w:color="C9D3DD" w:sz="4" w:space="0"/>
-              <w:bottom w:val="single" w:color="C9D3DD" w:sz="4" w:space="0"/>
-              <w:right w:val="single" w:color="C9D3DD" w:sz="4" w:space="0"/>
-            </w:tcBorders>
-            <w:shd w:val="clear" w:color="auto" w:fill="EEF3F7"/>
-            <w:tcMar>
-              <w:top w:w="60" w:type="dxa"/>
-              <w:left w:w="100" w:type="dxa"/>
-              <w:bottom w:w="60" w:type="dxa"/>
-              <w:right w:w="100" w:type="dxa"/>
-            </w:tcMar>
-          </w:tcPr>
-          <w:p>
-            <w:r>
-              <w:rPr>
-                <w:rFonts w:ascii="Consolas" w:hAnsi="Consolas" w:cs="Consolas"/>
-                <w:color w:val="333333"/>
-                <w:sz w:val="19"/>
-                <w:szCs w:val="19"/>
-              </w:rPr>
-              <w:t xml:space="preserve">REDCAP_API_TOKEN</w:t>
-            </w:r>
-          </w:p>
-        </w:tc>
-        <w:tc>
-          <w:tcPr>
-            <w:tcW w:type="dxa" w:w="6035"/>
-            <w:tcW w:w="6035" w:type="dxa"/>
-            <w:tcBorders>
-              <w:top w:val="single" w:color="C9D3DD" w:sz="4" w:space="0"/>
-              <w:left w:val="single" w:color="C9D3DD" w:sz="4" w:space="0"/>
-              <w:bottom w:val="single" w:color="C9D3DD" w:sz="4" w:space="0"/>
-              <w:right w:val="single" w:color="C9D3DD" w:sz="4" w:space="0"/>
-            </w:tcBorders>
-            <w:shd w:val="clear" w:color="auto" w:fill="EEF3F7"/>
-            <w:tcMar>
-              <w:top w:w="60" w:type="dxa"/>
-              <w:left w:w="100" w:type="dxa"/>
-              <w:bottom w:w="60" w:type="dxa"/>
-              <w:right w:w="100" w:type="dxa"/>
-            </w:tcMar>
-          </w:tcPr>
-          <w:p>
-            <w:r>
-              <w:rPr>
-                <w:sz w:val="20"/>
-                <w:szCs w:val="20"/>
-              </w:rPr>
-              <w:t xml:space="preserve">Project API token (import + export rights)</w:t>
-            </w:r>
-          </w:p>
-        </w:tc>
-      </w:tr>
-      <w:tr>
-        <w:trPr>
-          <w:cantSplit/>
-        </w:trPr>
-        <w:tc>
-          <w:tcPr>
-            <w:tcW w:type="dxa" w:w="3324"/>
-            <w:tcW w:w="3324" w:type="dxa"/>
-            <w:tcBorders>
-              <w:top w:val="single" w:color="C9D3DD" w:sz="4" w:space="0"/>
-              <w:left w:val="single" w:color="C9D3DD" w:sz="4" w:space="0"/>
-              <w:bottom w:val="single" w:color="C9D3DD" w:sz="4" w:space="0"/>
-              <w:right w:val="single" w:color="C9D3DD" w:sz="4" w:space="0"/>
-            </w:tcBorders>
-            <w:shd w:val="clear" w:color="auto" w:fill="FFFFFF"/>
-            <w:tcMar>
-              <w:top w:w="60" w:type="dxa"/>
-              <w:left w:w="100" w:type="dxa"/>
-              <w:bottom w:w="60" w:type="dxa"/>
-              <w:right w:w="100" w:type="dxa"/>
-            </w:tcMar>
-          </w:tcPr>
-          <w:p>
-            <w:r>
-              <w:rPr>
-                <w:rFonts w:ascii="Consolas" w:hAnsi="Consolas" w:cs="Consolas"/>
-                <w:color w:val="333333"/>
-                <w:sz w:val="19"/>
-                <w:szCs w:val="19"/>
-              </w:rPr>
-              <w:t xml:space="preserve">SESSION_SECRET</w:t>
-            </w:r>
-          </w:p>
-        </w:tc>
-        <w:tc>
-          <w:tcPr>
-            <w:tcW w:type="dxa" w:w="6035"/>
-            <w:tcW w:w="6035" w:type="dxa"/>
-            <w:tcBorders>
-              <w:top w:val="single" w:color="C9D3DD" w:sz="4" w:space="0"/>
-              <w:left w:val="single" w:color="C9D3DD" w:sz="4" w:space="0"/>
-              <w:bottom w:val="single" w:color="C9D3DD" w:sz="4" w:space="0"/>
-              <w:right w:val="single" w:color="C9D3DD" w:sz="4" w:space="0"/>
-            </w:tcBorders>
-            <w:shd w:val="clear" w:color="auto" w:fill="FFFFFF"/>
-            <w:tcMar>
-              <w:top w:w="60" w:type="dxa"/>
-              <w:left w:w="100" w:type="dxa"/>
-              <w:bottom w:w="60" w:type="dxa"/>
-              <w:right w:w="100" w:type="dxa"/>
-            </w:tcMar>
-          </w:tcPr>
-          <w:p>
-            <w:r>
-              <w:rPr>
-                <w:sz w:val="20"/>
-                <w:szCs w:val="20"/>
-              </w:rPr>
-              <w:t xml:space="preserve">Signs the session cookie</w:t>
-            </w:r>
-          </w:p>
-        </w:tc>
-      </w:tr>
-      <w:tr>
-        <w:trPr>
-          <w:cantSplit/>
-        </w:trPr>
-        <w:tc>
-          <w:tcPr>
-            <w:tcW w:type="dxa" w:w="3324"/>
-            <w:tcW w:w="3324" w:type="dxa"/>
-            <w:tcBorders>
-              <w:top w:val="single" w:color="C9D3DD" w:sz="4" w:space="0"/>
-              <w:left w:val="single" w:color="C9D3DD" w:sz="4" w:space="0"/>
-              <w:bottom w:val="single" w:color="C9D3DD" w:sz="4" w:space="0"/>
-              <w:right w:val="single" w:color="C9D3DD" w:sz="4" w:space="0"/>
-            </w:tcBorders>
-            <w:shd w:val="clear" w:color="auto" w:fill="EEF3F7"/>
-            <w:tcMar>
-              <w:top w:w="60" w:type="dxa"/>
-              <w:left w:w="100" w:type="dxa"/>
-              <w:bottom w:w="60" w:type="dxa"/>
-              <w:right w:w="100" w:type="dxa"/>
-            </w:tcMar>
-          </w:tcPr>
-          <w:p>
-            <w:r>
-              <w:rPr>
-                <w:rFonts w:ascii="Consolas" w:hAnsi="Consolas" w:cs="Consolas"/>
-                <w:color w:val="333333"/>
-                <w:sz w:val="19"/>
-                <w:szCs w:val="19"/>
-              </w:rPr>
-              <w:t xml:space="preserve">PROVISION_SECRET</w:t>
-            </w:r>
-          </w:p>
-        </w:tc>
-        <w:tc>
-          <w:tcPr>
-            <w:tcW w:type="dxa" w:w="6035"/>
-            <w:tcW w:w="6035" w:type="dxa"/>
-            <w:tcBorders>
-              <w:top w:val="single" w:color="C9D3DD" w:sz="4" w:space="0"/>
-              <w:left w:val="single" w:color="C9D3DD" w:sz="4" w:space="0"/>
-              <w:bottom w:val="single" w:color="C9D3DD" w:sz="4" w:space="0"/>
-              <w:right w:val="single" w:color="C9D3DD" w:sz="4" w:space="0"/>
-            </w:tcBorders>
-            <w:shd w:val="clear" w:color="auto" w:fill="EEF3F7"/>
-            <w:tcMar>
-              <w:top w:w="60" w:type="dxa"/>
-              <w:left w:w="100" w:type="dxa"/>
-              <w:bottom w:w="60" w:type="dxa"/>
-              <w:right w:w="100" w:type="dxa"/>
-            </w:tcMar>
-          </w:tcPr>
-          <w:p>
-            <w:r>
-              <w:rPr>
-                <w:sz w:val="20"/>
-                <w:szCs w:val="20"/>
-              </w:rPr>
-              <w:t xml:space="preserve">Shared secret appended to the Data Entry Trigger URL (</w:t>
-            </w:r>
-            <w:r>
-              <w:rPr>
-                <w:rFonts w:ascii="Consolas" w:hAnsi="Consolas" w:cs="Consolas"/>
-                <w:color w:val="333333"/>
-                <w:sz w:val="19"/>
-                <w:szCs w:val="19"/>
-              </w:rPr>
-              <w:t xml:space="preserve">?s=…</w:t>
-            </w:r>
-            <w:r>
-              <w:rPr>
-                <w:sz w:val="20"/>
-                <w:szCs w:val="20"/>
-              </w:rPr>
-              <w:t xml:space="preserve">)</w:t>
-            </w:r>
-          </w:p>
-        </w:tc>
-      </w:tr>
-      <w:tr>
-        <w:trPr>
-          <w:cantSplit/>
-        </w:trPr>
-        <w:tc>
-          <w:tcPr>
-            <w:tcW w:type="dxa" w:w="3324"/>
-            <w:tcW w:w="3324" w:type="dxa"/>
-            <w:tcBorders>
-              <w:top w:val="single" w:color="C9D3DD" w:sz="4" w:space="0"/>
-              <w:left w:val="single" w:color="C9D3DD" w:sz="4" w:space="0"/>
-              <w:bottom w:val="single" w:color="C9D3DD" w:sz="4" w:space="0"/>
-              <w:right w:val="single" w:color="C9D3DD" w:sz="4" w:space="0"/>
-            </w:tcBorders>
-            <w:shd w:val="clear" w:color="auto" w:fill="FFFFFF"/>
-            <w:tcMar>
-              <w:top w:w="60" w:type="dxa"/>
-              <w:left w:w="100" w:type="dxa"/>
-              <w:bottom w:w="60" w:type="dxa"/>
-              <w:right w:w="100" w:type="dxa"/>
-            </w:tcMar>
-          </w:tcPr>
-          <w:p>
-            <w:r>
-              <w:rPr>
-                <w:rFonts w:ascii="Consolas" w:hAnsi="Consolas" w:cs="Consolas"/>
-                <w:color w:val="333333"/>
-                <w:sz w:val="19"/>
-                <w:szCs w:val="19"/>
-              </w:rPr>
-              <w:t xml:space="preserve">REDCAP_PROJECT_ID</w:t>
-            </w:r>
-          </w:p>
-        </w:tc>
-        <w:tc>
-          <w:tcPr>
-            <w:tcW w:type="dxa" w:w="6035"/>
-            <w:tcW w:w="6035" w:type="dxa"/>
-            <w:tcBorders>
-              <w:top w:val="single" w:color="C9D3DD" w:sz="4" w:space="0"/>
-              <w:left w:val="single" w:color="C9D3DD" w:sz="4" w:space="0"/>
-              <w:bottom w:val="single" w:color="C9D3DD" w:sz="4" w:space="0"/>
-              <w:right w:val="single" w:color="C9D3DD" w:sz="4" w:space="0"/>
-            </w:tcBorders>
-            <w:shd w:val="clear" w:color="auto" w:fill="FFFFFF"/>
-            <w:tcMar>
-              <w:top w:w="60" w:type="dxa"/>
-              <w:left w:w="100" w:type="dxa"/>
-              <w:bottom w:w="60" w:type="dxa"/>
-              <w:right w:w="100" w:type="dxa"/>
-            </w:tcMar>
-          </w:tcPr>
-          <w:p>
-            <w:r>
-              <w:rPr>
-                <w:sz w:val="20"/>
-                <w:szCs w:val="20"/>
-              </w:rPr>
-              <w:t xml:space="preserve">Optional; rejects triggers from other projects</w:t>
-            </w:r>
-          </w:p>
-        </w:tc>
-      </w:tr>
-      <w:tr>
-        <w:trPr>
-          <w:cantSplit/>
-        </w:trPr>
-        <w:tc>
-          <w:tcPr>
-            <w:tcW w:type="dxa" w:w="3324"/>
-            <w:tcW w:w="3324" w:type="dxa"/>
-            <w:tcBorders>
-              <w:top w:val="single" w:color="C9D3DD" w:sz="4" w:space="0"/>
-              <w:left w:val="single" w:color="C9D3DD" w:sz="4" w:space="0"/>
-              <w:bottom w:val="single" w:color="C9D3DD" w:sz="4" w:space="0"/>
-              <w:right w:val="single" w:color="C9D3DD" w:sz="4" w:space="0"/>
-            </w:tcBorders>
-            <w:shd w:val="clear" w:color="auto" w:fill="EEF3F7"/>
-            <w:tcMar>
-              <w:top w:w="60" w:type="dxa"/>
-              <w:left w:w="100" w:type="dxa"/>
-              <w:bottom w:w="60" w:type="dxa"/>
-              <w:right w:w="100" w:type="dxa"/>
-            </w:tcMar>
-          </w:tcPr>
-          <w:p>
-            <w:r>
-              <w:rPr>
-                <w:rFonts w:ascii="Consolas" w:hAnsi="Consolas" w:cs="Consolas"/>
-                <w:color w:val="333333"/>
-                <w:sz w:val="19"/>
-                <w:szCs w:val="19"/>
-              </w:rPr>
-              <w:t xml:space="preserve">IMAGE_STATUS_FIELD</w:t>
-            </w:r>
-          </w:p>
-        </w:tc>
-        <w:tc>
-          <w:tcPr>
-            <w:tcW w:type="dxa" w:w="6035"/>
-            <w:tcW w:w="6035" w:type="dxa"/>
-            <w:tcBorders>
-              <w:top w:val="single" w:color="C9D3DD" w:sz="4" w:space="0"/>
-              <w:left w:val="single" w:color="C9D3DD" w:sz="4" w:space="0"/>
-              <w:bottom w:val="single" w:color="C9D3DD" w:sz="4" w:space="0"/>
-              <w:right w:val="single" w:color="C9D3DD" w:sz="4" w:space="0"/>
-            </w:tcBorders>
-            <w:shd w:val="clear" w:color="auto" w:fill="EEF3F7"/>
-            <w:tcMar>
-              <w:top w:w="60" w:type="dxa"/>
-              <w:left w:w="100" w:type="dxa"/>
-              <w:bottom w:w="60" w:type="dxa"/>
-              <w:right w:w="100" w:type="dxa"/>
-            </w:tcMar>
-          </w:tcPr>
-          <w:p>
-            <w:r>
-              <w:rPr>
-                <w:sz w:val="20"/>
-                <w:szCs w:val="20"/>
-              </w:rPr>
-              <w:t xml:space="preserve">Optional; name of a REDCap text field that receives </w:t>
-            </w:r>
-            <w:r>
-              <w:rPr>
-                <w:rFonts w:ascii="Consolas" w:hAnsi="Consolas" w:cs="Consolas"/>
-                <w:color w:val="333333"/>
-                <w:sz w:val="19"/>
-                <w:szCs w:val="19"/>
-              </w:rPr>
-              <w:t xml:space="preserve">complete</w:t>
-            </w:r>
-            <w:r>
-              <w:rPr>
-                <w:sz w:val="20"/>
-                <w:szCs w:val="20"/>
-              </w:rPr>
-              <w:t xml:space="preserve"> or </w:t>
-            </w:r>
-            <w:r>
-              <w:rPr>
-                <w:rFonts w:ascii="Consolas" w:hAnsi="Consolas" w:cs="Consolas"/>
-                <w:color w:val="333333"/>
-                <w:sz w:val="19"/>
-                <w:szCs w:val="19"/>
-              </w:rPr>
-              <w:t xml:space="preserve">missing: &lt;fields&gt;</w:t>
-            </w:r>
-            <w:r>
-              <w:rPr>
-                <w:sz w:val="20"/>
-                <w:szCs w:val="20"/>
-              </w:rPr>
-              <w:t xml:space="preserve"> after each submission. The field must exist in the data dictionary, on the same form/event as the answers</w:t>
-            </w:r>
-          </w:p>
-        </w:tc>
-      </w:tr>
-    </w:tbl>
-    <w:p>
-      <w:pPr>
-        <w:spacing w:before="0" w:after="60"/>
-      </w:pPr>
-    </w:p>
-    <w:p>
-      <w:pPr>
-        <w:spacing w:after="120"/>
-      </w:pPr>
-      <w:r>
-        <w:rPr/>
-        <w:t xml:space="preserve">The REDCap project must be </w:t>
-      </w:r>
-      <w:r>
-        <w:rPr>
-          <w:b/>
-        </w:rPr>
-        <w:t xml:space="preserve">longitudinal</w:t>
-      </w:r>
-      <w:r>
-        <w:rPr/>
-        <w:t xml:space="preserve"> with the unique event names </w:t>
-      </w:r>
-      <w:r>
-        <w:rPr>
-          <w:rFonts w:ascii="Consolas" w:hAnsi="Consolas" w:cs="Consolas"/>
-          <w:color w:val="333333"/>
-          <w:sz w:val="19"/>
-          <w:szCs w:val="19"/>
-        </w:rPr>
-        <w:t xml:space="preserve">baseline_arm_1</w:t>
-      </w:r>
-      <w:r>
-        <w:rPr/>
-        <w:t xml:space="preserve">, </w:t>
-      </w:r>
-      <w:r>
-        <w:rPr>
-          <w:rFonts w:ascii="Consolas" w:hAnsi="Consolas" w:cs="Consolas"/>
-          <w:color w:val="333333"/>
-          <w:sz w:val="19"/>
-          <w:szCs w:val="19"/>
-        </w:rPr>
-        <w:t xml:space="preserve">6_weeks_arm_1</w:t>
-      </w:r>
-      <w:r>
-        <w:rPr/>
-        <w:t xml:space="preserve"> and </w:t>
-      </w:r>
-      <w:r>
-        <w:rPr>
-          <w:rFonts w:ascii="Consolas" w:hAnsi="Consolas" w:cs="Consolas"/>
-          <w:color w:val="333333"/>
-          <w:sz w:val="19"/>
-          <w:szCs w:val="19"/>
-        </w:rPr>
-        <w:t xml:space="preserve">3_months_arm_1</w:t>
-      </w:r>
-      <w:r>
-        <w:rPr/>
-        <w:t xml:space="preserve">; a text field </w:t>
-      </w:r>
-      <w:r>
-        <w:rPr>
-          <w:rFonts w:ascii="Consolas" w:hAnsi="Consolas" w:cs="Consolas"/>
-          <w:color w:val="333333"/>
-          <w:sz w:val="19"/>
-          <w:szCs w:val="19"/>
-        </w:rPr>
-        <w:t xml:space="preserve">access_key</w:t>
-      </w:r>
-      <w:r>
-        <w:rPr/>
-        <w:t xml:space="preserve">; file-upload fields </w:t>
-      </w:r>
-      <w:r>
-        <w:rPr>
-          <w:rFonts w:ascii="Consolas" w:hAnsi="Consolas" w:cs="Consolas"/>
-          <w:color w:val="333333"/>
-          <w:sz w:val="19"/>
-          <w:szCs w:val="19"/>
-        </w:rPr>
-        <w:t xml:space="preserve">katz_l_palmar</w:t>
-      </w:r>
-      <w:r>
-        <w:rPr/>
-        <w:t xml:space="preserve">, </w:t>
-      </w:r>
-      <w:r>
-        <w:rPr>
-          <w:rFonts w:ascii="Consolas" w:hAnsi="Consolas" w:cs="Consolas"/>
-          <w:color w:val="333333"/>
-          <w:sz w:val="19"/>
-          <w:szCs w:val="19"/>
-        </w:rPr>
-        <w:t xml:space="preserve">katz_l_dorsal</w:t>
-      </w:r>
-      <w:r>
-        <w:rPr/>
-        <w:t xml:space="preserve">, </w:t>
-      </w:r>
-      <w:r>
-        <w:rPr>
-          <w:rFonts w:ascii="Consolas" w:hAnsi="Consolas" w:cs="Consolas"/>
-          <w:color w:val="333333"/>
-          <w:sz w:val="19"/>
-          <w:szCs w:val="19"/>
-        </w:rPr>
-        <w:t xml:space="preserve">katz_r_palmar</w:t>
-      </w:r>
-      <w:r>
-        <w:rPr/>
-        <w:t xml:space="preserve">, </w:t>
-      </w:r>
-      <w:r>
-        <w:rPr>
-          <w:rFonts w:ascii="Consolas" w:hAnsi="Consolas" w:cs="Consolas"/>
-          <w:color w:val="333333"/>
-          <w:sz w:val="19"/>
-          <w:szCs w:val="19"/>
-        </w:rPr>
-        <w:t xml:space="preserve">katz_r_dorsal</w:t>
-      </w:r>
-      <w:r>
-        <w:rPr/>
-        <w:t xml:space="preserve">; and the questionnaire, score and coverage fields produced by </w:t>
-      </w:r>
-      <w:r>
-        <w:rPr>
-          <w:rFonts w:ascii="Consolas" w:hAnsi="Consolas" w:cs="Consolas"/>
-          <w:color w:val="333333"/>
-          <w:sz w:val="19"/>
-          <w:szCs w:val="19"/>
-        </w:rPr>
-        <w:t xml:space="preserve">buildFieldMap</w:t>
-      </w:r>
-      <w:r>
-        <w:rPr/>
-        <w:t xml:space="preserve">. Coded values are: Yes = 1 / No = 0; pregnancy question Yes = 1 / No = 2 / Not relevant = 3; ease ratings 1 (Very easy) to 4 (Very difficult); Katz classification 0 (Unlikely) to 3 (Classic).</w:t>
-      </w:r>
-    </w:p>
-    <w:p>
-      <w:pPr>
-        <w:pStyle w:val="Heading2"/>
-        <w:keepNext/>
-        <w:keepLines/>
-      </w:pPr>
-      <w:r>
-        <w:t>5.4 Where it lives in the code</w:t>
+        <w:t>5.3 Where it lives in the code</w:t>
       </w:r>
     </w:p>
     <w:p>
@@ -8575,49 +7917,7 @@
         <w:keepLines/>
       </w:pPr>
       <w:r>
-        <w:t>6.3 Where the data travels in study mode</w:t>
-      </w:r>
-    </w:p>
-    <w:p>
-      <w:pPr>
-        <w:spacing w:after="120"/>
-      </w:pPr>
-      <w:r>
-        <w:rPr/>
-        <w:t xml:space="preserve">In the original design, a submission goes </w:t>
-      </w:r>
-      <w:r>
-        <w:rPr>
-          <w:b/>
-        </w:rPr>
-        <w:t xml:space="preserve">browser → Cloudflare → Western REDCap</w:t>
-      </w:r>
-      <w:r>
-        <w:rPr/>
-        <w:t xml:space="preserve">. Cloudflare terminates the encrypted (HTTPS) connection at its nearest data centre and runs the </w:t>
-      </w:r>
-      <w:r>
-        <w:rPr>
-          <w:rFonts w:ascii="Consolas" w:hAnsi="Consolas" w:cs="Consolas"/>
-          <w:color w:val="333333"/>
-          <w:sz w:val="19"/>
-          <w:szCs w:val="19"/>
-        </w:rPr>
-        <w:t xml:space="preserve">submit</w:t>
-      </w:r>
-      <w:r>
-        <w:rPr/>
-        <w:t xml:space="preserve"> function there, so the submission is briefly readable inside Cloudflare's infrastructure before it is re-sent to REDCap. Cloudflare is a US company with a global network, and the data centre handling a given request is not guaranteed to be in Canada. Section 7 covers why this is a problem for ethics approval.</w:t>
-      </w:r>
-    </w:p>
-    <w:p>
-      <w:pPr>
-        <w:pStyle w:val="Heading2"/>
-        <w:keepNext/>
-        <w:keepLines/>
-      </w:pPr>
-      <w:r>
-        <w:t>6.4 Where it lives in the code</w:t>
+        <w:t>6.3 Where it lives in the code</w:t>
       </w:r>
     </w:p>
     <w:p>
@@ -8743,7 +8043,17 @@
       </w:pPr>
       <w:r>
         <w:rPr/>
-        <w:t xml:space="preserve">When a participant's results are submitted, they pass through Cloudflare before reaching REDCap (Section 6.3). Cloudflare decrypts the request to run the </w:t>
+        <w:t xml:space="preserve">In the original design a submission travels </w:t>
+      </w:r>
+      <w:r>
+        <w:rPr>
+          <w:b/>
+        </w:rPr>
+        <w:t xml:space="preserve">browser → Cloudflare → REDCap</w:t>
+      </w:r>
+      <w:r>
+        <w:rPr/>
+        <w:t xml:space="preserve">. Cloudflare ends the encrypted (HTTPS) connection at its nearest data centre, which is not guaranteed to be in Canada, and runs the </w:t>
       </w:r>
       <w:r>
         <w:rPr>
@@ -8756,7 +8066,7 @@
       </w:r>
       <w:r>
         <w:rPr/>
-        <w:t xml:space="preserve"> function, so participant data is briefly accessible to a US-based company, possibly on servers outside Canada. The REB requires the data to stay in Canada and under the institution's control the whole way through, so any option that routes data through a global cloud service has been set aside.</w:t>
+        <w:t xml:space="preserve"> function there, so participant data is briefly readable inside the infrastructure of a US-based company. The REB requires the data to stay in Canada and under the institution's control the whole way through, so any option that routes data through a global cloud service has been set aside.</w:t>
       </w:r>
     </w:p>
     <w:p>
@@ -9994,7 +9304,7 @@
       </w:r>
       <w:r>
         <w:rPr/>
-        <w:t xml:space="preserve">) can be served by the same server. The five secrets in Section 5.3 move to that server's configuration, and REDCap's Data Entry Trigger URL must point at the new address.</w:t>
+        <w:t xml:space="preserve">) can be served by the same server. The server secrets (Walkthrough, Section 4.2) move to that server's configuration, and REDCap's Data Entry Trigger URL must point at the new address.</w:t>
       </w:r>
     </w:p>
     <w:p>
@@ -10114,7 +9424,7 @@
       </w:pPr>
       <w:r>
         <w:rPr/>
-        <w:t xml:space="preserve">The steps to implement option 2a are drafted in the walkthrough, Section 3.</w:t>
+        <w:t xml:space="preserve">The steps to implement option 2a are drafted in the Walkthrough, Section 3.</w:t>
       </w:r>
     </w:p>
     <w:p>
@@ -10133,9 +9443,9 @@
         <w:tblLayout w:type="fixed"/>
       </w:tblPr>
       <w:tblGrid>
-        <w:gridCol w:w="2246"/>
-        <w:gridCol w:w="3283"/>
-        <w:gridCol w:w="3830"/>
+        <w:gridCol w:w="2071"/>
+        <w:gridCol w:w="2840"/>
+        <w:gridCol w:w="4447"/>
       </w:tblGrid>
       <w:tr>
         <w:trPr>
@@ -10143,8 +9453,8 @@
         </w:trPr>
         <w:tc>
           <w:tcPr>
-            <w:tcW w:type="dxa" w:w="2246"/>
-            <w:tcW w:w="2246" w:type="dxa"/>
+            <w:tcW w:type="dxa" w:w="2071"/>
+            <w:tcW w:w="2071" w:type="dxa"/>
             <w:tcBorders>
               <w:top w:val="single" w:color="C9D3DD" w:sz="4" w:space="0"/>
               <w:left w:val="single" w:color="C9D3DD" w:sz="4" w:space="0"/>
@@ -10173,8 +9483,8 @@
         </w:tc>
         <w:tc>
           <w:tcPr>
-            <w:tcW w:type="dxa" w:w="3283"/>
-            <w:tcW w:w="3283" w:type="dxa"/>
+            <w:tcW w:type="dxa" w:w="2840"/>
+            <w:tcW w:w="2840" w:type="dxa"/>
             <w:tcBorders>
               <w:top w:val="single" w:color="C9D3DD" w:sz="4" w:space="0"/>
               <w:left w:val="single" w:color="C9D3DD" w:sz="4" w:space="0"/>
@@ -10203,8 +9513,8 @@
         </w:tc>
         <w:tc>
           <w:tcPr>
-            <w:tcW w:type="dxa" w:w="3830"/>
-            <w:tcW w:w="3830" w:type="dxa"/>
+            <w:tcW w:type="dxa" w:w="4447"/>
+            <w:tcW w:w="4447" w:type="dxa"/>
             <w:tcBorders>
               <w:top w:val="single" w:color="C9D3DD" w:sz="4" w:space="0"/>
               <w:left w:val="single" w:color="C9D3DD" w:sz="4" w:space="0"/>
@@ -10238,8 +9548,8 @@
         </w:trPr>
         <w:tc>
           <w:tcPr>
-            <w:tcW w:type="dxa" w:w="2246"/>
-            <w:tcW w:w="2246" w:type="dxa"/>
+            <w:tcW w:type="dxa" w:w="2071"/>
+            <w:tcW w:w="2071" w:type="dxa"/>
             <w:tcBorders>
               <w:top w:val="single" w:color="C9D3DD" w:sz="4" w:space="0"/>
               <w:left w:val="single" w:color="C9D3DD" w:sz="4" w:space="0"/>
@@ -10266,8 +9576,8 @@
         </w:tc>
         <w:tc>
           <w:tcPr>
-            <w:tcW w:type="dxa" w:w="3283"/>
-            <w:tcW w:w="3283" w:type="dxa"/>
+            <w:tcW w:type="dxa" w:w="2840"/>
+            <w:tcW w:w="2840" w:type="dxa"/>
             <w:tcBorders>
               <w:top w:val="single" w:color="C9D3DD" w:sz="4" w:space="0"/>
               <w:left w:val="single" w:color="C9D3DD" w:sz="4" w:space="0"/>
@@ -10294,8 +9604,8 @@
         </w:tc>
         <w:tc>
           <w:tcPr>
-            <w:tcW w:type="dxa" w:w="3830"/>
-            <w:tcW w:w="3830" w:type="dxa"/>
+            <w:tcW w:type="dxa" w:w="4447"/>
+            <w:tcW w:w="4447" w:type="dxa"/>
             <w:tcBorders>
               <w:top w:val="single" w:color="C9D3DD" w:sz="4" w:space="0"/>
               <w:left w:val="single" w:color="C9D3DD" w:sz="4" w:space="0"/>
@@ -10352,8 +9662,8 @@
         </w:trPr>
         <w:tc>
           <w:tcPr>
-            <w:tcW w:type="dxa" w:w="2246"/>
-            <w:tcW w:w="2246" w:type="dxa"/>
+            <w:tcW w:type="dxa" w:w="2071"/>
+            <w:tcW w:w="2071" w:type="dxa"/>
             <w:tcBorders>
               <w:top w:val="single" w:color="C9D3DD" w:sz="4" w:space="0"/>
               <w:left w:val="single" w:color="C9D3DD" w:sz="4" w:space="0"/>
@@ -10380,8 +9690,8 @@
         </w:tc>
         <w:tc>
           <w:tcPr>
-            <w:tcW w:type="dxa" w:w="3283"/>
-            <w:tcW w:w="3283" w:type="dxa"/>
+            <w:tcW w:type="dxa" w:w="2840"/>
+            <w:tcW w:w="2840" w:type="dxa"/>
             <w:tcBorders>
               <w:top w:val="single" w:color="C9D3DD" w:sz="4" w:space="0"/>
               <w:left w:val="single" w:color="C9D3DD" w:sz="4" w:space="0"/>
@@ -10408,8 +9718,8 @@
         </w:tc>
         <w:tc>
           <w:tcPr>
-            <w:tcW w:type="dxa" w:w="3830"/>
-            <w:tcW w:w="3830" w:type="dxa"/>
+            <w:tcW w:type="dxa" w:w="4447"/>
+            <w:tcW w:w="4447" w:type="dxa"/>
             <w:tcBorders>
               <w:top w:val="single" w:color="C9D3DD" w:sz="4" w:space="0"/>
               <w:left w:val="single" w:color="C9D3DD" w:sz="4" w:space="0"/>
@@ -10441,8 +9751,8 @@
         </w:trPr>
         <w:tc>
           <w:tcPr>
-            <w:tcW w:type="dxa" w:w="2246"/>
-            <w:tcW w:w="2246" w:type="dxa"/>
+            <w:tcW w:type="dxa" w:w="2071"/>
+            <w:tcW w:w="2071" w:type="dxa"/>
             <w:tcBorders>
               <w:top w:val="single" w:color="C9D3DD" w:sz="4" w:space="0"/>
               <w:left w:val="single" w:color="C9D3DD" w:sz="4" w:space="0"/>
@@ -10469,8 +9779,8 @@
         </w:tc>
         <w:tc>
           <w:tcPr>
-            <w:tcW w:type="dxa" w:w="3283"/>
-            <w:tcW w:w="3283" w:type="dxa"/>
+            <w:tcW w:type="dxa" w:w="2840"/>
+            <w:tcW w:w="2840" w:type="dxa"/>
             <w:tcBorders>
               <w:top w:val="single" w:color="C9D3DD" w:sz="4" w:space="0"/>
               <w:left w:val="single" w:color="C9D3DD" w:sz="4" w:space="0"/>
@@ -10497,8 +9807,8 @@
         </w:tc>
         <w:tc>
           <w:tcPr>
-            <w:tcW w:type="dxa" w:w="3830"/>
-            <w:tcW w:w="3830" w:type="dxa"/>
+            <w:tcW w:type="dxa" w:w="4447"/>
+            <w:tcW w:w="4447" w:type="dxa"/>
             <w:tcBorders>
               <w:top w:val="single" w:color="C9D3DD" w:sz="4" w:space="0"/>
               <w:left w:val="single" w:color="C9D3DD" w:sz="4" w:space="0"/>
@@ -10530,8 +9840,8 @@
         </w:trPr>
         <w:tc>
           <w:tcPr>
-            <w:tcW w:type="dxa" w:w="2246"/>
-            <w:tcW w:w="2246" w:type="dxa"/>
+            <w:tcW w:type="dxa" w:w="2071"/>
+            <w:tcW w:w="2071" w:type="dxa"/>
             <w:tcBorders>
               <w:top w:val="single" w:color="C9D3DD" w:sz="4" w:space="0"/>
               <w:left w:val="single" w:color="C9D3DD" w:sz="4" w:space="0"/>
@@ -10558,8 +9868,8 @@
         </w:tc>
         <w:tc>
           <w:tcPr>
-            <w:tcW w:type="dxa" w:w="3283"/>
-            <w:tcW w:w="3283" w:type="dxa"/>
+            <w:tcW w:type="dxa" w:w="2840"/>
+            <w:tcW w:w="2840" w:type="dxa"/>
             <w:tcBorders>
               <w:top w:val="single" w:color="C9D3DD" w:sz="4" w:space="0"/>
               <w:left w:val="single" w:color="C9D3DD" w:sz="4" w:space="0"/>
@@ -10586,8 +9896,8 @@
         </w:tc>
         <w:tc>
           <w:tcPr>
-            <w:tcW w:type="dxa" w:w="3830"/>
-            <w:tcW w:w="3830" w:type="dxa"/>
+            <w:tcW w:type="dxa" w:w="4447"/>
+            <w:tcW w:w="4447" w:type="dxa"/>
             <w:tcBorders>
               <w:top w:val="single" w:color="C9D3DD" w:sz="4" w:space="0"/>
               <w:left w:val="single" w:color="C9D3DD" w:sz="4" w:space="0"/>
@@ -10628,8 +9938,8 @@
         </w:trPr>
         <w:tc>
           <w:tcPr>
-            <w:tcW w:type="dxa" w:w="2246"/>
-            <w:tcW w:w="2246" w:type="dxa"/>
+            <w:tcW w:type="dxa" w:w="2071"/>
+            <w:tcW w:w="2071" w:type="dxa"/>
             <w:tcBorders>
               <w:top w:val="single" w:color="C9D3DD" w:sz="4" w:space="0"/>
               <w:left w:val="single" w:color="C9D3DD" w:sz="4" w:space="0"/>
@@ -10656,8 +9966,8 @@
         </w:tc>
         <w:tc>
           <w:tcPr>
-            <w:tcW w:type="dxa" w:w="3283"/>
-            <w:tcW w:w="3283" w:type="dxa"/>
+            <w:tcW w:type="dxa" w:w="2840"/>
+            <w:tcW w:w="2840" w:type="dxa"/>
             <w:tcBorders>
               <w:top w:val="single" w:color="C9D3DD" w:sz="4" w:space="0"/>
               <w:left w:val="single" w:color="C9D3DD" w:sz="4" w:space="0"/>
@@ -10684,8 +9994,8 @@
         </w:tc>
         <w:tc>
           <w:tcPr>
-            <w:tcW w:type="dxa" w:w="3830"/>
-            <w:tcW w:w="3830" w:type="dxa"/>
+            <w:tcW w:type="dxa" w:w="4447"/>
+            <w:tcW w:w="4447" w:type="dxa"/>
             <w:tcBorders>
               <w:top w:val="single" w:color="C9D3DD" w:sz="4" w:space="0"/>
               <w:left w:val="single" w:color="C9D3DD" w:sz="4" w:space="0"/>
@@ -10717,8 +10027,8 @@
         </w:trPr>
         <w:tc>
           <w:tcPr>
-            <w:tcW w:type="dxa" w:w="2246"/>
-            <w:tcW w:w="2246" w:type="dxa"/>
+            <w:tcW w:type="dxa" w:w="2071"/>
+            <w:tcW w:w="2071" w:type="dxa"/>
             <w:tcBorders>
               <w:top w:val="single" w:color="C9D3DD" w:sz="4" w:space="0"/>
               <w:left w:val="single" w:color="C9D3DD" w:sz="4" w:space="0"/>
@@ -10745,8 +10055,8 @@
         </w:tc>
         <w:tc>
           <w:tcPr>
-            <w:tcW w:type="dxa" w:w="3283"/>
-            <w:tcW w:w="3283" w:type="dxa"/>
+            <w:tcW w:type="dxa" w:w="2840"/>
+            <w:tcW w:w="2840" w:type="dxa"/>
             <w:tcBorders>
               <w:top w:val="single" w:color="C9D3DD" w:sz="4" w:space="0"/>
               <w:left w:val="single" w:color="C9D3DD" w:sz="4" w:space="0"/>
@@ -10767,14 +10077,14 @@
                 <w:sz w:val="20"/>
                 <w:szCs w:val="20"/>
               </w:rPr>
-              <w:t xml:space="preserve">Unit tests (scoring, symptom flags, CSV, idle timeout)</w:t>
-            </w:r>
-          </w:p>
-        </w:tc>
-        <w:tc>
-          <w:tcPr>
-            <w:tcW w:type="dxa" w:w="3830"/>
-            <w:tcW w:w="3830" w:type="dxa"/>
+              <w:t xml:space="preserve">Unit tests (scoring, symptom flags, CSV, idle timeout, REDCap functions)</w:t>
+            </w:r>
+          </w:p>
+        </w:tc>
+        <w:tc>
+          <w:tcPr>
+            <w:tcW w:type="dxa" w:w="4447"/>
+            <w:tcW w:w="4447" w:type="dxa"/>
             <w:tcBorders>
               <w:top w:val="single" w:color="C9D3DD" w:sz="4" w:space="0"/>
               <w:left w:val="single" w:color="C9D3DD" w:sz="4" w:space="0"/>
@@ -10815,8 +10125,8 @@
         </w:trPr>
         <w:tc>
           <w:tcPr>
-            <w:tcW w:type="dxa" w:w="2246"/>
-            <w:tcW w:w="2246" w:type="dxa"/>
+            <w:tcW w:type="dxa" w:w="2071"/>
+            <w:tcW w:w="2071" w:type="dxa"/>
             <w:tcBorders>
               <w:top w:val="single" w:color="C9D3DD" w:sz="4" w:space="0"/>
               <w:left w:val="single" w:color="C9D3DD" w:sz="4" w:space="0"/>
@@ -10843,8 +10153,8 @@
         </w:tc>
         <w:tc>
           <w:tcPr>
-            <w:tcW w:type="dxa" w:w="3283"/>
-            <w:tcW w:w="3283" w:type="dxa"/>
+            <w:tcW w:type="dxa" w:w="2840"/>
+            <w:tcW w:w="2840" w:type="dxa"/>
             <w:tcBorders>
               <w:top w:val="single" w:color="C9D3DD" w:sz="4" w:space="0"/>
               <w:left w:val="single" w:color="C9D3DD" w:sz="4" w:space="0"/>
@@ -10871,8 +10181,8 @@
         </w:tc>
         <w:tc>
           <w:tcPr>
-            <w:tcW w:type="dxa" w:w="3830"/>
-            <w:tcW w:w="3830" w:type="dxa"/>
+            <w:tcW w:type="dxa" w:w="4447"/>
+            <w:tcW w:w="4447" w:type="dxa"/>
             <w:tcBorders>
               <w:top w:val="single" w:color="C9D3DD" w:sz="4" w:space="0"/>
               <w:left w:val="single" w:color="C9D3DD" w:sz="4" w:space="0"/>
@@ -10913,8 +10223,8 @@
         </w:trPr>
         <w:tc>
           <w:tcPr>
-            <w:tcW w:type="dxa" w:w="2246"/>
-            <w:tcW w:w="2246" w:type="dxa"/>
+            <w:tcW w:type="dxa" w:w="2071"/>
+            <w:tcW w:w="2071" w:type="dxa"/>
             <w:tcBorders>
               <w:top w:val="single" w:color="C9D3DD" w:sz="4" w:space="0"/>
               <w:left w:val="single" w:color="C9D3DD" w:sz="4" w:space="0"/>
@@ -10935,14 +10245,14 @@
                 <w:sz w:val="20"/>
                 <w:szCs w:val="20"/>
               </w:rPr>
-              <w:t xml:space="preserve">Cloudflare Pages + Pages Functions</w:t>
-            </w:r>
-          </w:p>
-        </w:tc>
-        <w:tc>
-          <w:tcPr>
-            <w:tcW w:type="dxa" w:w="3283"/>
-            <w:tcW w:w="3283" w:type="dxa"/>
+              <w:t xml:space="preserve">GitHub Actions</w:t>
+            </w:r>
+          </w:p>
+        </w:tc>
+        <w:tc>
+          <w:tcPr>
+            <w:tcW w:type="dxa" w:w="2840"/>
+            <w:tcW w:w="2840" w:type="dxa"/>
             <w:tcBorders>
               <w:top w:val="single" w:color="C9D3DD" w:sz="4" w:space="0"/>
               <w:left w:val="single" w:color="C9D3DD" w:sz="4" w:space="0"/>
@@ -10963,7 +10273,35 @@
                 <w:sz w:val="20"/>
                 <w:szCs w:val="20"/>
               </w:rPr>
-              <w:t xml:space="preserve">Hosting of the demo, and the REDCap server functions on the </w:t>
+              <w:t xml:space="preserve">CI: lint, tests and build</w:t>
+            </w:r>
+          </w:p>
+        </w:tc>
+        <w:tc>
+          <w:tcPr>
+            <w:tcW w:type="dxa" w:w="4447"/>
+            <w:tcW w:w="4447" w:type="dxa"/>
+            <w:tcBorders>
+              <w:top w:val="single" w:color="C9D3DD" w:sz="4" w:space="0"/>
+              <w:left w:val="single" w:color="C9D3DD" w:sz="4" w:space="0"/>
+              <w:bottom w:val="single" w:color="C9D3DD" w:sz="4" w:space="0"/>
+              <w:right w:val="single" w:color="C9D3DD" w:sz="4" w:space="0"/>
+            </w:tcBorders>
+            <w:shd w:val="clear" w:color="auto" w:fill="EEF3F7"/>
+            <w:tcMar>
+              <w:top w:w="60" w:type="dxa"/>
+              <w:left w:w="100" w:type="dxa"/>
+              <w:bottom w:w="60" w:type="dxa"/>
+              <w:right w:w="100" w:type="dxa"/>
+            </w:tcMar>
+          </w:tcPr>
+          <w:p>
+            <w:r>
+              <w:rPr>
+                <w:sz w:val="20"/>
+                <w:szCs w:val="20"/>
+              </w:rPr>
+              <w:t xml:space="preserve">Runs on every push and pull request (</w:t>
             </w:r>
             <w:r>
               <w:rPr>
@@ -10972,6 +10310,83 @@
                 <w:sz w:val="19"/>
                 <w:szCs w:val="19"/>
               </w:rPr>
+              <w:t xml:space="preserve">.github/workflows/ci.yml</w:t>
+            </w:r>
+            <w:r>
+              <w:rPr>
+                <w:sz w:val="20"/>
+                <w:szCs w:val="20"/>
+              </w:rPr>
+              <w:t xml:space="preserve">)</w:t>
+            </w:r>
+          </w:p>
+        </w:tc>
+      </w:tr>
+      <w:tr>
+        <w:trPr>
+          <w:cantSplit/>
+        </w:trPr>
+        <w:tc>
+          <w:tcPr>
+            <w:tcW w:type="dxa" w:w="2071"/>
+            <w:tcW w:w="2071" w:type="dxa"/>
+            <w:tcBorders>
+              <w:top w:val="single" w:color="C9D3DD" w:sz="4" w:space="0"/>
+              <w:left w:val="single" w:color="C9D3DD" w:sz="4" w:space="0"/>
+              <w:bottom w:val="single" w:color="C9D3DD" w:sz="4" w:space="0"/>
+              <w:right w:val="single" w:color="C9D3DD" w:sz="4" w:space="0"/>
+            </w:tcBorders>
+            <w:shd w:val="clear" w:color="auto" w:fill="FFFFFF"/>
+            <w:tcMar>
+              <w:top w:w="60" w:type="dxa"/>
+              <w:left w:w="100" w:type="dxa"/>
+              <w:bottom w:w="60" w:type="dxa"/>
+              <w:right w:w="100" w:type="dxa"/>
+            </w:tcMar>
+          </w:tcPr>
+          <w:p>
+            <w:r>
+              <w:rPr>
+                <w:sz w:val="20"/>
+                <w:szCs w:val="20"/>
+              </w:rPr>
+              <w:t xml:space="preserve">Cloudflare Pages + Pages Functions</w:t>
+            </w:r>
+          </w:p>
+        </w:tc>
+        <w:tc>
+          <w:tcPr>
+            <w:tcW w:type="dxa" w:w="2840"/>
+            <w:tcW w:w="2840" w:type="dxa"/>
+            <w:tcBorders>
+              <w:top w:val="single" w:color="C9D3DD" w:sz="4" w:space="0"/>
+              <w:left w:val="single" w:color="C9D3DD" w:sz="4" w:space="0"/>
+              <w:bottom w:val="single" w:color="C9D3DD" w:sz="4" w:space="0"/>
+              <w:right w:val="single" w:color="C9D3DD" w:sz="4" w:space="0"/>
+            </w:tcBorders>
+            <w:shd w:val="clear" w:color="auto" w:fill="FFFFFF"/>
+            <w:tcMar>
+              <w:top w:w="60" w:type="dxa"/>
+              <w:left w:w="100" w:type="dxa"/>
+              <w:bottom w:w="60" w:type="dxa"/>
+              <w:right w:w="100" w:type="dxa"/>
+            </w:tcMar>
+          </w:tcPr>
+          <w:p>
+            <w:r>
+              <w:rPr>
+                <w:sz w:val="20"/>
+                <w:szCs w:val="20"/>
+              </w:rPr>
+              <w:t xml:space="preserve">Hosting of the demo, and the REDCap server functions on the </w:t>
+            </w:r>
+            <w:r>
+              <w:rPr>
+                <w:rFonts w:ascii="Consolas" w:hAnsi="Consolas" w:cs="Consolas"/>
+                <w:color w:val="333333"/>
+                <w:sz w:val="19"/>
+                <w:szCs w:val="19"/>
+              </w:rPr>
               <w:t xml:space="preserve">redcap</w:t>
             </w:r>
             <w:r>
@@ -10985,15 +10400,15 @@
         </w:tc>
         <w:tc>
           <w:tcPr>
-            <w:tcW w:type="dxa" w:w="3830"/>
-            <w:tcW w:w="3830" w:type="dxa"/>
-            <w:tcBorders>
-              <w:top w:val="single" w:color="C9D3DD" w:sz="4" w:space="0"/>
-              <w:left w:val="single" w:color="C9D3DD" w:sz="4" w:space="0"/>
-              <w:bottom w:val="single" w:color="C9D3DD" w:sz="4" w:space="0"/>
-              <w:right w:val="single" w:color="C9D3DD" w:sz="4" w:space="0"/>
-            </w:tcBorders>
-            <w:shd w:val="clear" w:color="auto" w:fill="EEF3F7"/>
+            <w:tcW w:type="dxa" w:w="4447"/>
+            <w:tcW w:w="4447" w:type="dxa"/>
+            <w:tcBorders>
+              <w:top w:val="single" w:color="C9D3DD" w:sz="4" w:space="0"/>
+              <w:left w:val="single" w:color="C9D3DD" w:sz="4" w:space="0"/>
+              <w:bottom w:val="single" w:color="C9D3DD" w:sz="4" w:space="0"/>
+              <w:right w:val="single" w:color="C9D3DD" w:sz="4" w:space="0"/>
+            </w:tcBorders>
+            <w:shd w:val="clear" w:color="auto" w:fill="FFFFFF"/>
             <w:tcMar>
               <w:top w:w="60" w:type="dxa"/>
               <w:left w:w="100" w:type="dxa"/>
@@ -11017,15 +10432,6 @@
       <w:pPr>
         <w:spacing w:before="0" w:after="60"/>
       </w:pPr>
-    </w:p>
-    <w:p>
-      <w:pPr>
-        <w:spacing w:after="120"/>
-      </w:pPr>
-      <w:r>
-        <w:rPr/>
-        <w:t xml:space="preserve">There is currently no automated CI (no GitHub Actions workflow); tests and lint only run when someone runs them locally.</w:t>
-      </w:r>
     </w:p>
     <w:p>
       <w:pPr>
@@ -11039,6 +10445,7 @@
     </w:p>
     <w:p>
       <w:pPr>
+        <w:keepLines/>
         <w:shd w:val="clear" w:color="auto" w:fill="F4F6F8"/>
         <w:ind w:left="180"/>
         <w:spacing w:before="60" w:after="160"/>
@@ -11093,7 +10500,7 @@
       </w:pPr>
       <w:r>
         <w:rPr/>
-        <w:t xml:space="preserve">The walkthrough, Section 2, covers running the app locally and the change-and-review workflow. This table maps common changes to the files involved.</w:t>
+        <w:t xml:space="preserve">The Walkthrough, Section 2, covers running the app locally and the change-and-review workflow. This table maps common changes to the files involved.</w:t>
       </w:r>
     </w:p>
     <w:tbl>
@@ -12293,7 +11700,7 @@
       </w:r>
       <w:r>
         <w:rPr/>
-        <w:t xml:space="preserve"> off Cloudflare to the chosen host. Steps for a Western-managed server are drafted in the walkthrough, Section 3. Update the Data Entry Trigger URL and the REDCap Alert link to the new address.</w:t>
+        <w:t xml:space="preserve"> off Cloudflare to the chosen host. Steps for a Western-managed server are drafted in the Walkthrough, Section 3. Update the Data Entry Trigger URL and the REDCap Alert link to the new address.</w:t>
       </w:r>
     </w:p>
     <w:p>
@@ -12386,26 +11793,6 @@
       <w:r>
         <w:rPr/>
         <w:t xml:space="preserve"> The submission timestamp comes from the participant's device clock and time zone. Consider stamping it on the server instead.</w:t>
-      </w:r>
-    </w:p>
-    <w:p>
-      <w:pPr>
-        <w:pStyle w:val="ListParagraph"/>
-        <w:numPr>
-          <w:ilvl w:val="0"/>
-          <w:numId w:val="158"/>
-        </w:numPr>
-        <w:spacing w:before="0" w:after="60"/>
-      </w:pPr>
-      <w:r>
-        <w:rPr>
-          <w:b/>
-        </w:rPr>
-        <w:t xml:space="preserve">Add CI.</w:t>
-      </w:r>
-      <w:r>
-        <w:rPr/>
-        <w:t xml:space="preserve"> A GitHub Actions workflow running lint, tests and build on every pull request (see the walkthrough, Section 2.3).</w:t>
       </w:r>
     </w:p>
     <w:sectPr>

</xml_diff>

<commit_message>
Docs: add the WTS server cost breakdown to the overview
Overview Section 7.2 now shows what each part of the proposed $64
covers and why it is sized that way; the walkthrough glossary defines
VM, CPU core, RAM and storage.

Co-Authored-By: Claude Opus 5.5 <noreply@anthropic.com>
Claude-Session: https://claude.ai/code/session_01WvzECS9tkcDkGpWoZeB54Z
</commit_message>
<xml_diff>
--- a/docs/CTS_Design_Workflow_Overview.docx
+++ b/docs/CTS_Design_Workflow_Overview.docx
@@ -9169,7 +9169,919 @@
       </w:pPr>
       <w:r>
         <w:rPr/>
-        <w:t xml:space="preserve">Cost figures are planning estimates taken from the review; confirm current pricing, Western internal rates and REB / TRAC requirements before relying on them.</w:t>
+        <w:t xml:space="preserve">Cost figures for options 1a, 1b and 2b are planning estimates taken from the review; confirm current pricing and REB / TRAC requirements before relying on them.</w:t>
+      </w:r>
+    </w:p>
+    <w:p>
+      <w:pPr>
+        <w:spacing w:after="120"/>
+      </w:pPr>
+      <w:r>
+        <w:rPr>
+          <w:b/>
+        </w:rPr>
+        <w:t xml:space="preserve">Option 2a cost.</w:t>
+      </w:r>
+      <w:r>
+        <w:rPr/>
+        <w:t xml:space="preserve"> WTS's </w:t>
+      </w:r>
+      <w:hyperlink r:id="rId18" w:history="1">
+        <w:r>
+          <w:rPr>
+            <w:rStyle w:val="Hyperlink"/>
+          </w:rPr>
+          <w:t xml:space="preserve">Virtual Server Hosting</w:t>
+        </w:r>
+      </w:hyperlink>
+      <w:r>
+        <w:rPr/>
+        <w:t xml:space="preserve"> page (checked October 2026) lists internal shared-server rates of $40 per server, $3 per CPU core, $4 per GB of RAM and $0.10 per GB of storage. The page does not state the billing period; the review treats it as monthly. The proposed server comes to $64:</w:t>
+      </w:r>
+    </w:p>
+    <w:tbl>
+      <w:tblPr>
+        <w:tblW w:w="9360" w:type="dxa"/>
+        <w:tblLayout w:type="fixed"/>
+      </w:tblPr>
+      <w:tblGrid>
+        <w:gridCol w:w="1184"/>
+        <w:gridCol w:w="2595"/>
+        <w:gridCol w:w="1285"/>
+        <w:gridCol w:w="865"/>
+        <w:gridCol w:w="3429"/>
+      </w:tblGrid>
+      <w:tr>
+        <w:trPr>
+          <w:tblHeader/>
+        </w:trPr>
+        <w:tc>
+          <w:tcPr>
+            <w:tcW w:type="dxa" w:w="1184"/>
+            <w:tcW w:w="1184" w:type="dxa"/>
+            <w:tcBorders>
+              <w:top w:val="single" w:color="C9D3DD" w:sz="4" w:space="0"/>
+              <w:left w:val="single" w:color="C9D3DD" w:sz="4" w:space="0"/>
+              <w:bottom w:val="single" w:color="C9D3DD" w:sz="4" w:space="0"/>
+              <w:right w:val="single" w:color="C9D3DD" w:sz="4" w:space="0"/>
+            </w:tcBorders>
+            <w:shd w:val="clear" w:color="auto" w:fill="1F3A5F"/>
+            <w:tcMar>
+              <w:top w:w="60" w:type="dxa"/>
+              <w:left w:w="100" w:type="dxa"/>
+              <w:bottom w:w="60" w:type="dxa"/>
+              <w:right w:w="100" w:type="dxa"/>
+            </w:tcMar>
+          </w:tcPr>
+          <w:p>
+            <w:r>
+              <w:rPr>
+                <w:b/>
+                <w:sz w:val="20"/>
+                <w:szCs w:val="20"/>
+                <w:color w:val="FFFFFF"/>
+              </w:rPr>
+              <w:t xml:space="preserve">Part</w:t>
+            </w:r>
+          </w:p>
+        </w:tc>
+        <w:tc>
+          <w:tcPr>
+            <w:tcW w:type="dxa" w:w="2595"/>
+            <w:tcW w:w="2595" w:type="dxa"/>
+            <w:tcBorders>
+              <w:top w:val="single" w:color="C9D3DD" w:sz="4" w:space="0"/>
+              <w:left w:val="single" w:color="C9D3DD" w:sz="4" w:space="0"/>
+              <w:bottom w:val="single" w:color="C9D3DD" w:sz="4" w:space="0"/>
+              <w:right w:val="single" w:color="C9D3DD" w:sz="4" w:space="0"/>
+            </w:tcBorders>
+            <w:shd w:val="clear" w:color="auto" w:fill="1F3A5F"/>
+            <w:tcMar>
+              <w:top w:w="60" w:type="dxa"/>
+              <w:left w:w="100" w:type="dxa"/>
+              <w:bottom w:w="60" w:type="dxa"/>
+              <w:right w:w="100" w:type="dxa"/>
+            </w:tcMar>
+          </w:tcPr>
+          <w:p>
+            <w:r>
+              <w:rPr>
+                <w:b/>
+                <w:sz w:val="20"/>
+                <w:szCs w:val="20"/>
+                <w:color w:val="FFFFFF"/>
+              </w:rPr>
+              <w:t xml:space="preserve">What it is</w:t>
+            </w:r>
+          </w:p>
+        </w:tc>
+        <w:tc>
+          <w:tcPr>
+            <w:tcW w:type="dxa" w:w="1285"/>
+            <w:tcW w:w="1285" w:type="dxa"/>
+            <w:tcBorders>
+              <w:top w:val="single" w:color="C9D3DD" w:sz="4" w:space="0"/>
+              <w:left w:val="single" w:color="C9D3DD" w:sz="4" w:space="0"/>
+              <w:bottom w:val="single" w:color="C9D3DD" w:sz="4" w:space="0"/>
+              <w:right w:val="single" w:color="C9D3DD" w:sz="4" w:space="0"/>
+            </w:tcBorders>
+            <w:shd w:val="clear" w:color="auto" w:fill="1F3A5F"/>
+            <w:tcMar>
+              <w:top w:w="60" w:type="dxa"/>
+              <w:left w:w="100" w:type="dxa"/>
+              <w:bottom w:w="60" w:type="dxa"/>
+              <w:right w:w="100" w:type="dxa"/>
+            </w:tcMar>
+          </w:tcPr>
+          <w:p>
+            <w:r>
+              <w:rPr>
+                <w:b/>
+                <w:sz w:val="20"/>
+                <w:szCs w:val="20"/>
+                <w:color w:val="FFFFFF"/>
+              </w:rPr>
+              <w:t xml:space="preserve">Proposed</w:t>
+            </w:r>
+          </w:p>
+        </w:tc>
+        <w:tc>
+          <w:tcPr>
+            <w:tcW w:type="dxa" w:w="865"/>
+            <w:tcW w:w="865" w:type="dxa"/>
+            <w:tcBorders>
+              <w:top w:val="single" w:color="C9D3DD" w:sz="4" w:space="0"/>
+              <w:left w:val="single" w:color="C9D3DD" w:sz="4" w:space="0"/>
+              <w:bottom w:val="single" w:color="C9D3DD" w:sz="4" w:space="0"/>
+              <w:right w:val="single" w:color="C9D3DD" w:sz="4" w:space="0"/>
+            </w:tcBorders>
+            <w:shd w:val="clear" w:color="auto" w:fill="1F3A5F"/>
+            <w:tcMar>
+              <w:top w:w="60" w:type="dxa"/>
+              <w:left w:w="100" w:type="dxa"/>
+              <w:bottom w:w="60" w:type="dxa"/>
+              <w:right w:w="100" w:type="dxa"/>
+            </w:tcMar>
+          </w:tcPr>
+          <w:p>
+            <w:r>
+              <w:rPr>
+                <w:b/>
+                <w:sz w:val="20"/>
+                <w:szCs w:val="20"/>
+                <w:color w:val="FFFFFF"/>
+              </w:rPr>
+              <w:t xml:space="preserve">Cost</w:t>
+            </w:r>
+          </w:p>
+        </w:tc>
+        <w:tc>
+          <w:tcPr>
+            <w:tcW w:type="dxa" w:w="3429"/>
+            <w:tcW w:w="3429" w:type="dxa"/>
+            <w:tcBorders>
+              <w:top w:val="single" w:color="C9D3DD" w:sz="4" w:space="0"/>
+              <w:left w:val="single" w:color="C9D3DD" w:sz="4" w:space="0"/>
+              <w:bottom w:val="single" w:color="C9D3DD" w:sz="4" w:space="0"/>
+              <w:right w:val="single" w:color="C9D3DD" w:sz="4" w:space="0"/>
+            </w:tcBorders>
+            <w:shd w:val="clear" w:color="auto" w:fill="1F3A5F"/>
+            <w:tcMar>
+              <w:top w:w="60" w:type="dxa"/>
+              <w:left w:w="100" w:type="dxa"/>
+              <w:bottom w:w="60" w:type="dxa"/>
+              <w:right w:w="100" w:type="dxa"/>
+            </w:tcMar>
+          </w:tcPr>
+          <w:p>
+            <w:r>
+              <w:rPr>
+                <w:b/>
+                <w:sz w:val="20"/>
+                <w:szCs w:val="20"/>
+                <w:color w:val="FFFFFF"/>
+              </w:rPr>
+              <w:t xml:space="preserve">Why this size</w:t>
+            </w:r>
+          </w:p>
+        </w:tc>
+      </w:tr>
+      <w:tr>
+        <w:trPr>
+          <w:cantSplit/>
+        </w:trPr>
+        <w:tc>
+          <w:tcPr>
+            <w:tcW w:type="dxa" w:w="1184"/>
+            <w:tcW w:w="1184" w:type="dxa"/>
+            <w:tcBorders>
+              <w:top w:val="single" w:color="C9D3DD" w:sz="4" w:space="0"/>
+              <w:left w:val="single" w:color="C9D3DD" w:sz="4" w:space="0"/>
+              <w:bottom w:val="single" w:color="C9D3DD" w:sz="4" w:space="0"/>
+              <w:right w:val="single" w:color="C9D3DD" w:sz="4" w:space="0"/>
+            </w:tcBorders>
+            <w:shd w:val="clear" w:color="auto" w:fill="FFFFFF"/>
+            <w:tcMar>
+              <w:top w:w="60" w:type="dxa"/>
+              <w:left w:w="100" w:type="dxa"/>
+              <w:bottom w:w="60" w:type="dxa"/>
+              <w:right w:w="100" w:type="dxa"/>
+            </w:tcMar>
+          </w:tcPr>
+          <w:p>
+            <w:r>
+              <w:rPr>
+                <w:sz w:val="20"/>
+                <w:szCs w:val="20"/>
+              </w:rPr>
+              <w:t xml:space="preserve">Base VM</w:t>
+            </w:r>
+          </w:p>
+        </w:tc>
+        <w:tc>
+          <w:tcPr>
+            <w:tcW w:type="dxa" w:w="2595"/>
+            <w:tcW w:w="2595" w:type="dxa"/>
+            <w:tcBorders>
+              <w:top w:val="single" w:color="C9D3DD" w:sz="4" w:space="0"/>
+              <w:left w:val="single" w:color="C9D3DD" w:sz="4" w:space="0"/>
+              <w:bottom w:val="single" w:color="C9D3DD" w:sz="4" w:space="0"/>
+              <w:right w:val="single" w:color="C9D3DD" w:sz="4" w:space="0"/>
+            </w:tcBorders>
+            <w:shd w:val="clear" w:color="auto" w:fill="FFFFFF"/>
+            <w:tcMar>
+              <w:top w:w="60" w:type="dxa"/>
+              <w:left w:w="100" w:type="dxa"/>
+              <w:bottom w:w="60" w:type="dxa"/>
+              <w:right w:w="100" w:type="dxa"/>
+            </w:tcMar>
+          </w:tcPr>
+          <w:p>
+            <w:r>
+              <w:rPr>
+                <w:sz w:val="20"/>
+                <w:szCs w:val="20"/>
+              </w:rPr>
+              <w:t xml:space="preserve">The virtual server itself; includes operating system licensing, backups and initial setup</w:t>
+            </w:r>
+          </w:p>
+        </w:tc>
+        <w:tc>
+          <w:tcPr>
+            <w:tcW w:type="dxa" w:w="1285"/>
+            <w:tcW w:w="1285" w:type="dxa"/>
+            <w:tcBorders>
+              <w:top w:val="single" w:color="C9D3DD" w:sz="4" w:space="0"/>
+              <w:left w:val="single" w:color="C9D3DD" w:sz="4" w:space="0"/>
+              <w:bottom w:val="single" w:color="C9D3DD" w:sz="4" w:space="0"/>
+              <w:right w:val="single" w:color="C9D3DD" w:sz="4" w:space="0"/>
+            </w:tcBorders>
+            <w:shd w:val="clear" w:color="auto" w:fill="FFFFFF"/>
+            <w:tcMar>
+              <w:top w:w="60" w:type="dxa"/>
+              <w:left w:w="100" w:type="dxa"/>
+              <w:bottom w:w="60" w:type="dxa"/>
+              <w:right w:w="100" w:type="dxa"/>
+            </w:tcMar>
+          </w:tcPr>
+          <w:p>
+            <w:r>
+              <w:rPr>
+                <w:sz w:val="20"/>
+                <w:szCs w:val="20"/>
+              </w:rPr>
+              <w:t xml:space="preserve">1</w:t>
+            </w:r>
+          </w:p>
+        </w:tc>
+        <w:tc>
+          <w:tcPr>
+            <w:tcW w:type="dxa" w:w="865"/>
+            <w:tcW w:w="865" w:type="dxa"/>
+            <w:tcBorders>
+              <w:top w:val="single" w:color="C9D3DD" w:sz="4" w:space="0"/>
+              <w:left w:val="single" w:color="C9D3DD" w:sz="4" w:space="0"/>
+              <w:bottom w:val="single" w:color="C9D3DD" w:sz="4" w:space="0"/>
+              <w:right w:val="single" w:color="C9D3DD" w:sz="4" w:space="0"/>
+            </w:tcBorders>
+            <w:shd w:val="clear" w:color="auto" w:fill="FFFFFF"/>
+            <w:tcMar>
+              <w:top w:w="60" w:type="dxa"/>
+              <w:left w:w="100" w:type="dxa"/>
+              <w:bottom w:w="60" w:type="dxa"/>
+              <w:right w:w="100" w:type="dxa"/>
+            </w:tcMar>
+          </w:tcPr>
+          <w:p>
+            <w:r>
+              <w:rPr>
+                <w:sz w:val="20"/>
+                <w:szCs w:val="20"/>
+              </w:rPr>
+              <w:t xml:space="preserve">$40</w:t>
+            </w:r>
+          </w:p>
+        </w:tc>
+        <w:tc>
+          <w:tcPr>
+            <w:tcW w:type="dxa" w:w="3429"/>
+            <w:tcW w:w="3429" w:type="dxa"/>
+            <w:tcBorders>
+              <w:top w:val="single" w:color="C9D3DD" w:sz="4" w:space="0"/>
+              <w:left w:val="single" w:color="C9D3DD" w:sz="4" w:space="0"/>
+              <w:bottom w:val="single" w:color="C9D3DD" w:sz="4" w:space="0"/>
+              <w:right w:val="single" w:color="C9D3DD" w:sz="4" w:space="0"/>
+            </w:tcBorders>
+            <w:shd w:val="clear" w:color="auto" w:fill="FFFFFF"/>
+            <w:tcMar>
+              <w:top w:w="60" w:type="dxa"/>
+              <w:left w:w="100" w:type="dxa"/>
+              <w:bottom w:w="60" w:type="dxa"/>
+              <w:right w:w="100" w:type="dxa"/>
+            </w:tcMar>
+          </w:tcPr>
+          <w:p>
+            <w:r>
+              <w:rPr>
+                <w:sz w:val="20"/>
+                <w:szCs w:val="20"/>
+              </w:rPr>
+              <w:t xml:space="preserve">Fixed charge per server</w:t>
+            </w:r>
+          </w:p>
+        </w:tc>
+      </w:tr>
+      <w:tr>
+        <w:trPr>
+          <w:cantSplit/>
+        </w:trPr>
+        <w:tc>
+          <w:tcPr>
+            <w:tcW w:type="dxa" w:w="1184"/>
+            <w:tcW w:w="1184" w:type="dxa"/>
+            <w:tcBorders>
+              <w:top w:val="single" w:color="C9D3DD" w:sz="4" w:space="0"/>
+              <w:left w:val="single" w:color="C9D3DD" w:sz="4" w:space="0"/>
+              <w:bottom w:val="single" w:color="C9D3DD" w:sz="4" w:space="0"/>
+              <w:right w:val="single" w:color="C9D3DD" w:sz="4" w:space="0"/>
+            </w:tcBorders>
+            <w:shd w:val="clear" w:color="auto" w:fill="EEF3F7"/>
+            <w:tcMar>
+              <w:top w:w="60" w:type="dxa"/>
+              <w:left w:w="100" w:type="dxa"/>
+              <w:bottom w:w="60" w:type="dxa"/>
+              <w:right w:w="100" w:type="dxa"/>
+            </w:tcMar>
+          </w:tcPr>
+          <w:p>
+            <w:r>
+              <w:rPr>
+                <w:sz w:val="20"/>
+                <w:szCs w:val="20"/>
+              </w:rPr>
+              <w:t xml:space="preserve">CPU cores</w:t>
+            </w:r>
+          </w:p>
+        </w:tc>
+        <w:tc>
+          <w:tcPr>
+            <w:tcW w:type="dxa" w:w="2595"/>
+            <w:tcW w:w="2595" w:type="dxa"/>
+            <w:tcBorders>
+              <w:top w:val="single" w:color="C9D3DD" w:sz="4" w:space="0"/>
+              <w:left w:val="single" w:color="C9D3DD" w:sz="4" w:space="0"/>
+              <w:bottom w:val="single" w:color="C9D3DD" w:sz="4" w:space="0"/>
+              <w:right w:val="single" w:color="C9D3DD" w:sz="4" w:space="0"/>
+            </w:tcBorders>
+            <w:shd w:val="clear" w:color="auto" w:fill="EEF3F7"/>
+            <w:tcMar>
+              <w:top w:w="60" w:type="dxa"/>
+              <w:left w:w="100" w:type="dxa"/>
+              <w:bottom w:w="60" w:type="dxa"/>
+              <w:right w:w="100" w:type="dxa"/>
+            </w:tcMar>
+          </w:tcPr>
+          <w:p>
+            <w:r>
+              <w:rPr>
+                <w:sz w:val="20"/>
+                <w:szCs w:val="20"/>
+              </w:rPr>
+              <w:t xml:space="preserve">Processing capacity: how many tasks the server can work on at once</w:t>
+            </w:r>
+          </w:p>
+        </w:tc>
+        <w:tc>
+          <w:tcPr>
+            <w:tcW w:type="dxa" w:w="1285"/>
+            <w:tcW w:w="1285" w:type="dxa"/>
+            <w:tcBorders>
+              <w:top w:val="single" w:color="C9D3DD" w:sz="4" w:space="0"/>
+              <w:left w:val="single" w:color="C9D3DD" w:sz="4" w:space="0"/>
+              <w:bottom w:val="single" w:color="C9D3DD" w:sz="4" w:space="0"/>
+              <w:right w:val="single" w:color="C9D3DD" w:sz="4" w:space="0"/>
+            </w:tcBorders>
+            <w:shd w:val="clear" w:color="auto" w:fill="EEF3F7"/>
+            <w:tcMar>
+              <w:top w:w="60" w:type="dxa"/>
+              <w:left w:w="100" w:type="dxa"/>
+              <w:bottom w:w="60" w:type="dxa"/>
+              <w:right w:w="100" w:type="dxa"/>
+            </w:tcMar>
+          </w:tcPr>
+          <w:p>
+            <w:r>
+              <w:rPr>
+                <w:sz w:val="20"/>
+                <w:szCs w:val="20"/>
+              </w:rPr>
+              <w:t xml:space="preserve">2 shared</w:t>
+            </w:r>
+          </w:p>
+        </w:tc>
+        <w:tc>
+          <w:tcPr>
+            <w:tcW w:type="dxa" w:w="865"/>
+            <w:tcW w:w="865" w:type="dxa"/>
+            <w:tcBorders>
+              <w:top w:val="single" w:color="C9D3DD" w:sz="4" w:space="0"/>
+              <w:left w:val="single" w:color="C9D3DD" w:sz="4" w:space="0"/>
+              <w:bottom w:val="single" w:color="C9D3DD" w:sz="4" w:space="0"/>
+              <w:right w:val="single" w:color="C9D3DD" w:sz="4" w:space="0"/>
+            </w:tcBorders>
+            <w:shd w:val="clear" w:color="auto" w:fill="EEF3F7"/>
+            <w:tcMar>
+              <w:top w:w="60" w:type="dxa"/>
+              <w:left w:w="100" w:type="dxa"/>
+              <w:bottom w:w="60" w:type="dxa"/>
+              <w:right w:w="100" w:type="dxa"/>
+            </w:tcMar>
+          </w:tcPr>
+          <w:p>
+            <w:r>
+              <w:rPr>
+                <w:sz w:val="20"/>
+                <w:szCs w:val="20"/>
+              </w:rPr>
+              <w:t xml:space="preserve">$6</w:t>
+            </w:r>
+          </w:p>
+        </w:tc>
+        <w:tc>
+          <w:tcPr>
+            <w:tcW w:type="dxa" w:w="3429"/>
+            <w:tcW w:w="3429" w:type="dxa"/>
+            <w:tcBorders>
+              <w:top w:val="single" w:color="C9D3DD" w:sz="4" w:space="0"/>
+              <w:left w:val="single" w:color="C9D3DD" w:sz="4" w:space="0"/>
+              <w:bottom w:val="single" w:color="C9D3DD" w:sz="4" w:space="0"/>
+              <w:right w:val="single" w:color="C9D3DD" w:sz="4" w:space="0"/>
+            </w:tcBorders>
+            <w:shd w:val="clear" w:color="auto" w:fill="EEF3F7"/>
+            <w:tcMar>
+              <w:top w:w="60" w:type="dxa"/>
+              <w:left w:w="100" w:type="dxa"/>
+              <w:bottom w:w="60" w:type="dxa"/>
+              <w:right w:w="100" w:type="dxa"/>
+            </w:tcMar>
+          </w:tcPr>
+          <w:p>
+            <w:r>
+              <w:rPr>
+                <w:sz w:val="20"/>
+                <w:szCs w:val="20"/>
+              </w:rPr>
+              <w:t xml:space="preserve">The app uses little processing; updates just run a little slower</w:t>
+            </w:r>
+          </w:p>
+        </w:tc>
+      </w:tr>
+      <w:tr>
+        <w:trPr>
+          <w:cantSplit/>
+        </w:trPr>
+        <w:tc>
+          <w:tcPr>
+            <w:tcW w:type="dxa" w:w="1184"/>
+            <w:tcW w:w="1184" w:type="dxa"/>
+            <w:tcBorders>
+              <w:top w:val="single" w:color="C9D3DD" w:sz="4" w:space="0"/>
+              <w:left w:val="single" w:color="C9D3DD" w:sz="4" w:space="0"/>
+              <w:bottom w:val="single" w:color="C9D3DD" w:sz="4" w:space="0"/>
+              <w:right w:val="single" w:color="C9D3DD" w:sz="4" w:space="0"/>
+            </w:tcBorders>
+            <w:shd w:val="clear" w:color="auto" w:fill="FFFFFF"/>
+            <w:tcMar>
+              <w:top w:w="60" w:type="dxa"/>
+              <w:left w:w="100" w:type="dxa"/>
+              <w:bottom w:w="60" w:type="dxa"/>
+              <w:right w:w="100" w:type="dxa"/>
+            </w:tcMar>
+          </w:tcPr>
+          <w:p>
+            <w:r>
+              <w:rPr>
+                <w:sz w:val="20"/>
+                <w:szCs w:val="20"/>
+              </w:rPr>
+              <w:t xml:space="preserve">RAM</w:t>
+            </w:r>
+          </w:p>
+        </w:tc>
+        <w:tc>
+          <w:tcPr>
+            <w:tcW w:type="dxa" w:w="2595"/>
+            <w:tcW w:w="2595" w:type="dxa"/>
+            <w:tcBorders>
+              <w:top w:val="single" w:color="C9D3DD" w:sz="4" w:space="0"/>
+              <w:left w:val="single" w:color="C9D3DD" w:sz="4" w:space="0"/>
+              <w:bottom w:val="single" w:color="C9D3DD" w:sz="4" w:space="0"/>
+              <w:right w:val="single" w:color="C9D3DD" w:sz="4" w:space="0"/>
+            </w:tcBorders>
+            <w:shd w:val="clear" w:color="auto" w:fill="FFFFFF"/>
+            <w:tcMar>
+              <w:top w:w="60" w:type="dxa"/>
+              <w:left w:w="100" w:type="dxa"/>
+              <w:bottom w:w="60" w:type="dxa"/>
+              <w:right w:w="100" w:type="dxa"/>
+            </w:tcMar>
+          </w:tcPr>
+          <w:p>
+            <w:r>
+              <w:rPr>
+                <w:sz w:val="20"/>
+                <w:szCs w:val="20"/>
+              </w:rPr>
+              <w:t xml:space="preserve">Short-term working memory used while programs run</w:t>
+            </w:r>
+          </w:p>
+        </w:tc>
+        <w:tc>
+          <w:tcPr>
+            <w:tcW w:type="dxa" w:w="1285"/>
+            <w:tcW w:w="1285" w:type="dxa"/>
+            <w:tcBorders>
+              <w:top w:val="single" w:color="C9D3DD" w:sz="4" w:space="0"/>
+              <w:left w:val="single" w:color="C9D3DD" w:sz="4" w:space="0"/>
+              <w:bottom w:val="single" w:color="C9D3DD" w:sz="4" w:space="0"/>
+              <w:right w:val="single" w:color="C9D3DD" w:sz="4" w:space="0"/>
+            </w:tcBorders>
+            <w:shd w:val="clear" w:color="auto" w:fill="FFFFFF"/>
+            <w:tcMar>
+              <w:top w:w="60" w:type="dxa"/>
+              <w:left w:w="100" w:type="dxa"/>
+              <w:bottom w:w="60" w:type="dxa"/>
+              <w:right w:w="100" w:type="dxa"/>
+            </w:tcMar>
+          </w:tcPr>
+          <w:p>
+            <w:r>
+              <w:rPr>
+                <w:sz w:val="20"/>
+                <w:szCs w:val="20"/>
+              </w:rPr>
+              <w:t xml:space="preserve">4 GB</w:t>
+            </w:r>
+          </w:p>
+        </w:tc>
+        <w:tc>
+          <w:tcPr>
+            <w:tcW w:type="dxa" w:w="865"/>
+            <w:tcW w:w="865" w:type="dxa"/>
+            <w:tcBorders>
+              <w:top w:val="single" w:color="C9D3DD" w:sz="4" w:space="0"/>
+              <w:left w:val="single" w:color="C9D3DD" w:sz="4" w:space="0"/>
+              <w:bottom w:val="single" w:color="C9D3DD" w:sz="4" w:space="0"/>
+              <w:right w:val="single" w:color="C9D3DD" w:sz="4" w:space="0"/>
+            </w:tcBorders>
+            <w:shd w:val="clear" w:color="auto" w:fill="FFFFFF"/>
+            <w:tcMar>
+              <w:top w:w="60" w:type="dxa"/>
+              <w:left w:w="100" w:type="dxa"/>
+              <w:bottom w:w="60" w:type="dxa"/>
+              <w:right w:w="100" w:type="dxa"/>
+            </w:tcMar>
+          </w:tcPr>
+          <w:p>
+            <w:r>
+              <w:rPr>
+                <w:sz w:val="20"/>
+                <w:szCs w:val="20"/>
+              </w:rPr>
+              <w:t xml:space="preserve">$16</w:t>
+            </w:r>
+          </w:p>
+        </w:tc>
+        <w:tc>
+          <w:tcPr>
+            <w:tcW w:type="dxa" w:w="3429"/>
+            <w:tcW w:w="3429" w:type="dxa"/>
+            <w:tcBorders>
+              <w:top w:val="single" w:color="C9D3DD" w:sz="4" w:space="0"/>
+              <w:left w:val="single" w:color="C9D3DD" w:sz="4" w:space="0"/>
+              <w:bottom w:val="single" w:color="C9D3DD" w:sz="4" w:space="0"/>
+              <w:right w:val="single" w:color="C9D3DD" w:sz="4" w:space="0"/>
+            </w:tcBorders>
+            <w:shd w:val="clear" w:color="auto" w:fill="FFFFFF"/>
+            <w:tcMar>
+              <w:top w:w="60" w:type="dxa"/>
+              <w:left w:w="100" w:type="dxa"/>
+              <w:bottom w:w="60" w:type="dxa"/>
+              <w:right w:w="100" w:type="dxa"/>
+            </w:tcMar>
+          </w:tcPr>
+          <w:p>
+            <w:r>
+              <w:rPr>
+                <w:sz w:val="20"/>
+                <w:szCs w:val="20"/>
+              </w:rPr>
+              <w:t xml:space="preserve">Measured: the app peaks at about 226 MB even with 300 simultaneous submissions, but updating it peaks at 1.1 GB while the app keeps running, plus the operating system and web server</w:t>
+            </w:r>
+          </w:p>
+        </w:tc>
+      </w:tr>
+      <w:tr>
+        <w:trPr>
+          <w:cantSplit/>
+        </w:trPr>
+        <w:tc>
+          <w:tcPr>
+            <w:tcW w:type="dxa" w:w="1184"/>
+            <w:tcW w:w="1184" w:type="dxa"/>
+            <w:tcBorders>
+              <w:top w:val="single" w:color="C9D3DD" w:sz="4" w:space="0"/>
+              <w:left w:val="single" w:color="C9D3DD" w:sz="4" w:space="0"/>
+              <w:bottom w:val="single" w:color="C9D3DD" w:sz="4" w:space="0"/>
+              <w:right w:val="single" w:color="C9D3DD" w:sz="4" w:space="0"/>
+            </w:tcBorders>
+            <w:shd w:val="clear" w:color="auto" w:fill="EEF3F7"/>
+            <w:tcMar>
+              <w:top w:w="60" w:type="dxa"/>
+              <w:left w:w="100" w:type="dxa"/>
+              <w:bottom w:w="60" w:type="dxa"/>
+              <w:right w:w="100" w:type="dxa"/>
+            </w:tcMar>
+          </w:tcPr>
+          <w:p>
+            <w:r>
+              <w:rPr>
+                <w:sz w:val="20"/>
+                <w:szCs w:val="20"/>
+              </w:rPr>
+              <w:t xml:space="preserve">Storage</w:t>
+            </w:r>
+          </w:p>
+        </w:tc>
+        <w:tc>
+          <w:tcPr>
+            <w:tcW w:type="dxa" w:w="2595"/>
+            <w:tcW w:w="2595" w:type="dxa"/>
+            <w:tcBorders>
+              <w:top w:val="single" w:color="C9D3DD" w:sz="4" w:space="0"/>
+              <w:left w:val="single" w:color="C9D3DD" w:sz="4" w:space="0"/>
+              <w:bottom w:val="single" w:color="C9D3DD" w:sz="4" w:space="0"/>
+              <w:right w:val="single" w:color="C9D3DD" w:sz="4" w:space="0"/>
+            </w:tcBorders>
+            <w:shd w:val="clear" w:color="auto" w:fill="EEF3F7"/>
+            <w:tcMar>
+              <w:top w:w="60" w:type="dxa"/>
+              <w:left w:w="100" w:type="dxa"/>
+              <w:bottom w:w="60" w:type="dxa"/>
+              <w:right w:w="100" w:type="dxa"/>
+            </w:tcMar>
+          </w:tcPr>
+          <w:p>
+            <w:r>
+              <w:rPr>
+                <w:sz w:val="20"/>
+                <w:szCs w:val="20"/>
+              </w:rPr>
+              <w:t xml:space="preserve">Disk space that keeps files permanently</w:t>
+            </w:r>
+          </w:p>
+        </w:tc>
+        <w:tc>
+          <w:tcPr>
+            <w:tcW w:type="dxa" w:w="1285"/>
+            <w:tcW w:w="1285" w:type="dxa"/>
+            <w:tcBorders>
+              <w:top w:val="single" w:color="C9D3DD" w:sz="4" w:space="0"/>
+              <w:left w:val="single" w:color="C9D3DD" w:sz="4" w:space="0"/>
+              <w:bottom w:val="single" w:color="C9D3DD" w:sz="4" w:space="0"/>
+              <w:right w:val="single" w:color="C9D3DD" w:sz="4" w:space="0"/>
+            </w:tcBorders>
+            <w:shd w:val="clear" w:color="auto" w:fill="EEF3F7"/>
+            <w:tcMar>
+              <w:top w:w="60" w:type="dxa"/>
+              <w:left w:w="100" w:type="dxa"/>
+              <w:bottom w:w="60" w:type="dxa"/>
+              <w:right w:w="100" w:type="dxa"/>
+            </w:tcMar>
+          </w:tcPr>
+          <w:p>
+            <w:r>
+              <w:rPr>
+                <w:sz w:val="20"/>
+                <w:szCs w:val="20"/>
+              </w:rPr>
+              <w:t xml:space="preserve">20 GB</w:t>
+            </w:r>
+          </w:p>
+        </w:tc>
+        <w:tc>
+          <w:tcPr>
+            <w:tcW w:type="dxa" w:w="865"/>
+            <w:tcW w:w="865" w:type="dxa"/>
+            <w:tcBorders>
+              <w:top w:val="single" w:color="C9D3DD" w:sz="4" w:space="0"/>
+              <w:left w:val="single" w:color="C9D3DD" w:sz="4" w:space="0"/>
+              <w:bottom w:val="single" w:color="C9D3DD" w:sz="4" w:space="0"/>
+              <w:right w:val="single" w:color="C9D3DD" w:sz="4" w:space="0"/>
+            </w:tcBorders>
+            <w:shd w:val="clear" w:color="auto" w:fill="EEF3F7"/>
+            <w:tcMar>
+              <w:top w:w="60" w:type="dxa"/>
+              <w:left w:w="100" w:type="dxa"/>
+              <w:bottom w:w="60" w:type="dxa"/>
+              <w:right w:w="100" w:type="dxa"/>
+            </w:tcMar>
+          </w:tcPr>
+          <w:p>
+            <w:r>
+              <w:rPr>
+                <w:sz w:val="20"/>
+                <w:szCs w:val="20"/>
+              </w:rPr>
+              <w:t xml:space="preserve">$2</w:t>
+            </w:r>
+          </w:p>
+        </w:tc>
+        <w:tc>
+          <w:tcPr>
+            <w:tcW w:type="dxa" w:w="3429"/>
+            <w:tcW w:w="3429" w:type="dxa"/>
+            <w:tcBorders>
+              <w:top w:val="single" w:color="C9D3DD" w:sz="4" w:space="0"/>
+              <w:left w:val="single" w:color="C9D3DD" w:sz="4" w:space="0"/>
+              <w:bottom w:val="single" w:color="C9D3DD" w:sz="4" w:space="0"/>
+              <w:right w:val="single" w:color="C9D3DD" w:sz="4" w:space="0"/>
+            </w:tcBorders>
+            <w:shd w:val="clear" w:color="auto" w:fill="EEF3F7"/>
+            <w:tcMar>
+              <w:top w:w="60" w:type="dxa"/>
+              <w:left w:w="100" w:type="dxa"/>
+              <w:bottom w:w="60" w:type="dxa"/>
+              <w:right w:w="100" w:type="dxa"/>
+            </w:tcMar>
+          </w:tcPr>
+          <w:p>
+            <w:r>
+              <w:rPr>
+                <w:sz w:val="20"/>
+                <w:szCs w:val="20"/>
+              </w:rPr>
+              <w:t xml:space="preserve">The app needs about 1 GB; the rest is for the operating system, updates and logs. Study data is stored in REDCap, not on the server</w:t>
+            </w:r>
+          </w:p>
+        </w:tc>
+      </w:tr>
+      <w:tr>
+        <w:trPr>
+          <w:cantSplit/>
+        </w:trPr>
+        <w:tc>
+          <w:tcPr>
+            <w:tcW w:type="dxa" w:w="1184"/>
+            <w:tcW w:w="1184" w:type="dxa"/>
+            <w:tcBorders>
+              <w:top w:val="single" w:color="C9D3DD" w:sz="4" w:space="0"/>
+              <w:left w:val="single" w:color="C9D3DD" w:sz="4" w:space="0"/>
+              <w:bottom w:val="single" w:color="C9D3DD" w:sz="4" w:space="0"/>
+              <w:right w:val="single" w:color="C9D3DD" w:sz="4" w:space="0"/>
+            </w:tcBorders>
+            <w:shd w:val="clear" w:color="auto" w:fill="FFFFFF"/>
+            <w:tcMar>
+              <w:top w:w="60" w:type="dxa"/>
+              <w:left w:w="100" w:type="dxa"/>
+              <w:bottom w:w="60" w:type="dxa"/>
+              <w:right w:w="100" w:type="dxa"/>
+            </w:tcMar>
+          </w:tcPr>
+          <w:p>
+            <w:r>
+              <w:rPr>
+                <w:b/>
+                <w:sz w:val="20"/>
+                <w:szCs w:val="20"/>
+              </w:rPr>
+              <w:t xml:space="preserve">Total</w:t>
+            </w:r>
+          </w:p>
+        </w:tc>
+        <w:tc>
+          <w:tcPr>
+            <w:tcW w:type="dxa" w:w="2595"/>
+            <w:tcW w:w="2595" w:type="dxa"/>
+            <w:tcBorders>
+              <w:top w:val="single" w:color="C9D3DD" w:sz="4" w:space="0"/>
+              <w:left w:val="single" w:color="C9D3DD" w:sz="4" w:space="0"/>
+              <w:bottom w:val="single" w:color="C9D3DD" w:sz="4" w:space="0"/>
+              <w:right w:val="single" w:color="C9D3DD" w:sz="4" w:space="0"/>
+            </w:tcBorders>
+            <w:shd w:val="clear" w:color="auto" w:fill="FFFFFF"/>
+            <w:tcMar>
+              <w:top w:w="60" w:type="dxa"/>
+              <w:left w:w="100" w:type="dxa"/>
+              <w:bottom w:w="60" w:type="dxa"/>
+              <w:right w:w="100" w:type="dxa"/>
+            </w:tcMar>
+          </w:tcPr>
+          <w:p/>
+        </w:tc>
+        <w:tc>
+          <w:tcPr>
+            <w:tcW w:type="dxa" w:w="1285"/>
+            <w:tcW w:w="1285" w:type="dxa"/>
+            <w:tcBorders>
+              <w:top w:val="single" w:color="C9D3DD" w:sz="4" w:space="0"/>
+              <w:left w:val="single" w:color="C9D3DD" w:sz="4" w:space="0"/>
+              <w:bottom w:val="single" w:color="C9D3DD" w:sz="4" w:space="0"/>
+              <w:right w:val="single" w:color="C9D3DD" w:sz="4" w:space="0"/>
+            </w:tcBorders>
+            <w:shd w:val="clear" w:color="auto" w:fill="FFFFFF"/>
+            <w:tcMar>
+              <w:top w:w="60" w:type="dxa"/>
+              <w:left w:w="100" w:type="dxa"/>
+              <w:bottom w:w="60" w:type="dxa"/>
+              <w:right w:w="100" w:type="dxa"/>
+            </w:tcMar>
+          </w:tcPr>
+          <w:p/>
+        </w:tc>
+        <w:tc>
+          <w:tcPr>
+            <w:tcW w:type="dxa" w:w="865"/>
+            <w:tcW w:w="865" w:type="dxa"/>
+            <w:tcBorders>
+              <w:top w:val="single" w:color="C9D3DD" w:sz="4" w:space="0"/>
+              <w:left w:val="single" w:color="C9D3DD" w:sz="4" w:space="0"/>
+              <w:bottom w:val="single" w:color="C9D3DD" w:sz="4" w:space="0"/>
+              <w:right w:val="single" w:color="C9D3DD" w:sz="4" w:space="0"/>
+            </w:tcBorders>
+            <w:shd w:val="clear" w:color="auto" w:fill="FFFFFF"/>
+            <w:tcMar>
+              <w:top w:w="60" w:type="dxa"/>
+              <w:left w:w="100" w:type="dxa"/>
+              <w:bottom w:w="60" w:type="dxa"/>
+              <w:right w:w="100" w:type="dxa"/>
+            </w:tcMar>
+          </w:tcPr>
+          <w:p>
+            <w:r>
+              <w:rPr>
+                <w:b/>
+                <w:sz w:val="20"/>
+                <w:szCs w:val="20"/>
+              </w:rPr>
+              <w:t xml:space="preserve">$64</w:t>
+            </w:r>
+          </w:p>
+        </w:tc>
+        <w:tc>
+          <w:tcPr>
+            <w:tcW w:type="dxa" w:w="3429"/>
+            <w:tcW w:w="3429" w:type="dxa"/>
+            <w:tcBorders>
+              <w:top w:val="single" w:color="C9D3DD" w:sz="4" w:space="0"/>
+              <w:left w:val="single" w:color="C9D3DD" w:sz="4" w:space="0"/>
+              <w:bottom w:val="single" w:color="C9D3DD" w:sz="4" w:space="0"/>
+              <w:right w:val="single" w:color="C9D3DD" w:sz="4" w:space="0"/>
+            </w:tcBorders>
+            <w:shd w:val="clear" w:color="auto" w:fill="FFFFFF"/>
+            <w:tcMar>
+              <w:top w:w="60" w:type="dxa"/>
+              <w:left w:w="100" w:type="dxa"/>
+              <w:bottom w:w="60" w:type="dxa"/>
+              <w:right w:w="100" w:type="dxa"/>
+            </w:tcMar>
+          </w:tcPr>
+          <w:p/>
+        </w:tc>
+      </w:tr>
+    </w:tbl>
+    <w:p>
+      <w:pPr>
+        <w:spacing w:before="0" w:after="60"/>
+      </w:pPr>
+    </w:p>
+    <w:p>
+      <w:pPr>
+        <w:spacing w:after="120"/>
+      </w:pPr>
+      <w:r>
+        <w:rPr/>
+        <w:t xml:space="preserve">Memory was measured by running the REDCap functions and the built site in a Node.js test server with a simulated REDCap. Setup steps and the WTS request are in the Walkthrough, Section 3.</w:t>
       </w:r>
     </w:p>
     <w:p>

</xml_diff>

<commit_message>
Overview 7.3: note option 1a must deploy without the functions folder
Co-Authored-By: Claude Opus 5.5 <noreply@anthropic.com>
Claude-Session: https://claude.ai/code/session_01WvzECS9tkcDkGpWoZeB54Z
</commit_message>
<xml_diff>
--- a/docs/CTS_Design_Workflow_Overview.docx
+++ b/docs/CTS_Design_Workflow_Overview.docx
@@ -10070,7 +10070,20 @@
       </w:r>
       <w:r>
         <w:rPr/>
-        <w:t xml:space="preserve"> is closest to done. The CSV download already uses the exact REDCap field names (Section 4). Its answers are written as words (Yes, No), while REDCap stores codes (1, 0), so the download should apply the same coding as the server before files are imported into REDCap. Remaining work: add the four hand-diagram images to the download (for example as one ZIP), set a file-naming routine, and remove or hide the automatic REDCap submission.</w:t>
+        <w:t xml:space="preserve"> is closest to done. The CSV download already uses the exact REDCap field names (Section 4). Its answers are written as words (Yes, No), while REDCap stores codes (1, 0), so the download should apply the same coding as the server before files are imported into REDCap. Remaining work: add the four hand-diagram images to the download (for example as one ZIP), make the download available on the study device (it is currently in the healthcare professional view only), and set a file-naming routine. Deploy from a branch without the </w:t>
+      </w:r>
+      <w:r>
+        <w:rPr>
+          <w:rFonts w:ascii="Consolas" w:hAnsi="Consolas" w:cs="Consolas"/>
+          <w:color w:val="333333"/>
+          <w:sz w:val="19"/>
+          <w:szCs w:val="19"/>
+        </w:rPr>
+        <w:t xml:space="preserve">functions/</w:t>
+      </w:r>
+      <w:r>
+        <w:rPr/>
+        <w:t xml:space="preserve"> folder: Cloudflare Pages deploys that folder automatically as server code, so leaving it out publishes only the static site and removes the REDCap submission path (Walkthrough, Section 3.1.1).</w:t>
       </w:r>
     </w:p>
     <w:p>

</xml_diff>

<commit_message>
Docs: point option 1a at the in-person branch (PR #2)
Overview 1.1 and 7.3 and Walkthrough 3.1.1 now describe the built
in-person export instead of listing it as work to do; the Cloudflare
production branch is main once PR #2 is merged.

Co-Authored-By: Claude Opus 5.5 <noreply@anthropic.com>
Claude-Session: https://claude.ai/code/session_01WvzECS9tkcDkGpWoZeB54Z
</commit_message>
<xml_diff>
--- a/docs/CTS_Design_Workflow_Overview.docx
+++ b/docs/CTS_Design_Workflow_Overview.docx
@@ -631,7 +631,7 @@
       </w:r>
       <w:r>
         <w:rPr/>
-        <w:t xml:space="preserve"> branch holds the standalone application; the </w:t>
+        <w:t xml:space="preserve"> branch holds the standalone application and, once pull request #2 (branch in-person) is merged, the in-person study export for option 1a; the </w:t>
       </w:r>
       <w:r>
         <w:rPr>
@@ -10070,7 +10070,7 @@
       </w:r>
       <w:r>
         <w:rPr/>
-        <w:t xml:space="preserve"> is closest to done. The CSV download already uses the exact REDCap field names (Section 4). Its answers are written as words (Yes, No), while REDCap stores codes (1, 0), so the download should apply the same coding as the server before files are imported into REDCap. Remaining work: add the four hand-diagram images to the download (for example as one ZIP), make the download available on the study device (it is currently in the healthcare professional view only), and set a file-naming routine. Deploy from a branch without the </w:t>
+        <w:t xml:space="preserve"> is built on the </w:t>
       </w:r>
       <w:r>
         <w:rPr>
@@ -10079,11 +10079,88 @@
           <w:sz w:val="19"/>
           <w:szCs w:val="19"/>
         </w:rPr>
+        <w:t xml:space="preserve">in-person</w:t>
+      </w:r>
+      <w:r>
+        <w:rPr/>
+        <w:t xml:space="preserve"> branch (</w:t>
+      </w:r>
+      <w:hyperlink r:id="rId18" w:history="1">
+        <w:r>
+          <w:rPr>
+            <w:rStyle w:val="Hyperlink"/>
+          </w:rPr>
+          <w:t xml:space="preserve">pull request #2</w:t>
+        </w:r>
+      </w:hyperlink>
+      <w:r>
+        <w:rPr/>
+        <w:t xml:space="preserve"> into </w:t>
+      </w:r>
+      <w:r>
+        <w:rPr>
+          <w:rFonts w:ascii="Consolas" w:hAnsi="Consolas" w:cs="Consolas"/>
+          <w:color w:val="333333"/>
+          <w:sz w:val="19"/>
+          <w:szCs w:val="19"/>
+        </w:rPr>
+        <w:t xml:space="preserve">main</w:t>
+      </w:r>
+      <w:r>
+        <w:rPr/>
+        <w:t xml:space="preserve">). On the Results page, study staff enter the participant ID and timepoint and save one ZIP to the encrypted study drive: a one-row CSV in REDCap's import format, with REDCap's codes (Yes = 1, No = 0), plus the four hand drawings named after their REDCap file-upload fields. </w:t>
+      </w:r>
+      <w:r>
+        <w:rPr>
+          <w:rFonts w:ascii="Consolas" w:hAnsi="Consolas" w:cs="Consolas"/>
+          <w:color w:val="333333"/>
+          <w:sz w:val="19"/>
+          <w:szCs w:val="19"/>
+        </w:rPr>
+        <w:t xml:space="preserve">main</w:t>
+      </w:r>
+      <w:r>
+        <w:rPr/>
+        <w:t xml:space="preserve"> has no </w:t>
+      </w:r>
+      <w:r>
+        <w:rPr>
+          <w:rFonts w:ascii="Consolas" w:hAnsi="Consolas" w:cs="Consolas"/>
+          <w:color w:val="333333"/>
+          <w:sz w:val="19"/>
+          <w:szCs w:val="19"/>
+        </w:rPr>
         <w:t xml:space="preserve">functions/</w:t>
       </w:r>
       <w:r>
         <w:rPr/>
-        <w:t xml:space="preserve"> folder: Cloudflare Pages deploys that folder automatically as server code, so leaving it out publishes only the static site and removes the REDCap submission path (Walkthrough, Section 3.1.1).</w:t>
+        <w:t xml:space="preserve"> folder, so deploying it to Cloudflare Pages publishes only the static site and nothing is submitted (Walkthrough, Section 3.1). The REDCap coding lives in </w:t>
+      </w:r>
+      <w:r>
+        <w:rPr>
+          <w:rFonts w:ascii="Consolas" w:hAnsi="Consolas" w:cs="Consolas"/>
+          <w:color w:val="333333"/>
+          <w:sz w:val="19"/>
+          <w:szCs w:val="19"/>
+        </w:rPr>
+        <w:t xml:space="preserve">lib/redcapCoding.js</w:t>
+      </w:r>
+      <w:r>
+        <w:rPr/>
+        <w:t xml:space="preserve">, shared with the </w:t>
+      </w:r>
+      <w:r>
+        <w:rPr>
+          <w:rFonts w:ascii="Consolas" w:hAnsi="Consolas" w:cs="Consolas"/>
+          <w:color w:val="333333"/>
+          <w:sz w:val="19"/>
+          <w:szCs w:val="19"/>
+        </w:rPr>
+        <w:t xml:space="preserve">redcap</w:t>
+      </w:r>
+      <w:r>
+        <w:rPr/>
+        <w:t xml:space="preserve"> branch. Not yet tested: importing the files into the study's REDCap project.</w:t>
       </w:r>
     </w:p>
     <w:p>

</xml_diff>

<commit_message>
Docs: option 1a lives on main
Co-Authored-By: Claude Opus 5.5 <noreply@anthropic.com>
Claude-Session: https://claude.ai/code/session_01WvzECS9tkcDkGpWoZeB54Z
</commit_message>
<xml_diff>
--- a/docs/CTS_Design_Workflow_Overview.docx
+++ b/docs/CTS_Design_Workflow_Overview.docx
@@ -631,7 +631,7 @@
       </w:r>
       <w:r>
         <w:rPr/>
-        <w:t xml:space="preserve"> branch holds the standalone application and, once pull request #2 (branch in-person) is merged, the in-person study export for option 1a; the </w:t>
+        <w:t xml:space="preserve"> branch holds the standalone application with the in-person study export for option 1a; the </w:t>
       </w:r>
       <w:r>
         <w:rPr>
@@ -10079,23 +10079,11 @@
           <w:sz w:val="19"/>
           <w:szCs w:val="19"/>
         </w:rPr>
-        <w:t xml:space="preserve">in-person</w:t>
-      </w:r>
-      <w:r>
-        <w:rPr/>
-        <w:t xml:space="preserve"> branch (</w:t>
-      </w:r>
-      <w:hyperlink r:id="rId18" w:history="1">
-        <w:r>
-          <w:rPr>
-            <w:rStyle w:val="Hyperlink"/>
-          </w:rPr>
-          <w:t xml:space="preserve">pull request #2</w:t>
-        </w:r>
-      </w:hyperlink>
-      <w:r>
-        <w:rPr/>
-        <w:t xml:space="preserve"> into </w:t>
+        <w:t xml:space="preserve">main</w:t>
+      </w:r>
+      <w:r>
+        <w:rPr/>
+        <w:t xml:space="preserve"> branch. On the Results page, study staff enter the participant ID and timepoint and save one ZIP to the encrypted study drive: a one-row CSV in REDCap's import format, with REDCap's codes (Yes = 1, No = 0), plus the four hand drawings named after their REDCap file-upload fields. </w:t>
       </w:r>
       <w:r>
         <w:rPr>
@@ -10108,7 +10096,7 @@
       </w:r>
       <w:r>
         <w:rPr/>
-        <w:t xml:space="preserve">). On the Results page, study staff enter the participant ID and timepoint and save one ZIP to the encrypted study drive: a one-row CSV in REDCap's import format, with REDCap's codes (Yes = 1, No = 0), plus the four hand drawings named after their REDCap file-upload fields. </w:t>
+        <w:t xml:space="preserve"> has no </w:t>
       </w:r>
       <w:r>
         <w:rPr>
@@ -10117,11 +10105,11 @@
           <w:sz w:val="19"/>
           <w:szCs w:val="19"/>
         </w:rPr>
-        <w:t xml:space="preserve">main</w:t>
-      </w:r>
-      <w:r>
-        <w:rPr/>
-        <w:t xml:space="preserve"> has no </w:t>
+        <w:t xml:space="preserve">functions/</w:t>
+      </w:r>
+      <w:r>
+        <w:rPr/>
+        <w:t xml:space="preserve"> folder, so deploying it to Cloudflare Pages publishes only the static site and nothing is submitted (Walkthrough, Section 3.1). The REDCap coding lives in </w:t>
       </w:r>
       <w:r>
         <w:rPr>
@@ -10130,24 +10118,11 @@
           <w:sz w:val="19"/>
           <w:szCs w:val="19"/>
         </w:rPr>
-        <w:t xml:space="preserve">functions/</w:t>
-      </w:r>
-      <w:r>
-        <w:rPr/>
-        <w:t xml:space="preserve"> folder, so deploying it to Cloudflare Pages publishes only the static site and nothing is submitted (Walkthrough, Section 3.1). The REDCap coding lives in </w:t>
-      </w:r>
-      <w:r>
-        <w:rPr>
-          <w:rFonts w:ascii="Consolas" w:hAnsi="Consolas" w:cs="Consolas"/>
-          <w:color w:val="333333"/>
-          <w:sz w:val="19"/>
-          <w:szCs w:val="19"/>
-        </w:rPr>
         <w:t xml:space="preserve">lib/redcapCoding.js</w:t>
       </w:r>
       <w:r>
         <w:rPr/>
-        <w:t xml:space="preserve">, shared with the </w:t>
+        <w:t xml:space="preserve">, with an identical copy on the </w:t>
       </w:r>
       <w:r>
         <w:rPr>

</xml_diff>

<commit_message>
Docs: compare the Results page on main and redcap; simplify WTS request
- Overview Section 4: a table of how the Results page differs between
  main (standalone / option 1a) and redcap (study mode / option 2a);
  Export bullets corrected for both branches.
- Walkthrough 3.2.1: drop the dedicated-core rate, add a line on how to
  lower the cost, and replace the technical WTS request list with plain
  points plus a note to ask about log retention.
- Reviewer edits from the latest draft applied.

Co-Authored-By: Claude Opus 5.5 <noreply@anthropic.com>
Claude-Session: https://claude.ai/code/session_01WvzECS9tkcDkGpWoZeB54Z
</commit_message>
<xml_diff>
--- a/docs/CTS_Design_Workflow_Overview.docx
+++ b/docs/CTS_Design_Workflow_Overview.docx
@@ -5765,7 +5765,7 @@
       </w:r>
       <w:r>
         <w:rPr/>
-        <w:t xml:space="preserve"> (healthcare professional view only, per PI decision) builds a file named </w:t>
+        <w:t xml:space="preserve"> builds a file named </w:t>
       </w:r>
       <w:r>
         <w:rPr>
@@ -5778,7 +5778,7 @@
       </w:r>
       <w:r>
         <w:rPr/>
-        <w:t xml:space="preserve"> in the browser. It uses exactly the same field names as the REDCap submission (Section 5), so it can serve as a manual backup or be imported into REDCap.</w:t>
+        <w:t xml:space="preserve"> in the browser, using the REDCap field names. It is a human-readable copy of the results; answers are written as words, not REDCap's codes.</w:t>
       </w:r>
     </w:p>
     <w:p>
@@ -5798,7 +5798,7 @@
       </w:r>
       <w:r>
         <w:rPr/>
-        <w:t xml:space="preserve"> is intended to print the results page using the print styles in </w:t>
+        <w:t xml:space="preserve"> prints the results page using the print styles in </w:t>
       </w:r>
       <w:r>
         <w:rPr>
@@ -5811,13 +5811,7 @@
       </w:r>
       <w:r>
         <w:rPr/>
-        <w:t xml:space="preserve">. </w:t>
-      </w:r>
-      <w:r>
-        <w:rPr>
-          <w:i/>
-        </w:rPr>
-        <w:t xml:space="preserve">(Note: this is only available on the redcap branch.)</w:t>
+        <w:t xml:space="preserve">; the printed copy includes the hand drawings.</w:t>
       </w:r>
     </w:p>
     <w:p>
@@ -5884,6 +5878,665 @@
           <w:color w:val="555555"/>
         </w:rPr>
         <w:t xml:space="preserve">Printed / saved-as-PDF copy of the patient view. Buttons and banners are hidden; the combined hand drawings are included.</w:t>
+      </w:r>
+    </w:p>
+    <w:p>
+      <w:pPr>
+        <w:pStyle w:val="Heading3"/>
+        <w:keepNext/>
+        <w:keepLines/>
+      </w:pPr>
+      <w:r>
+        <w:t>Results page on each branch</w:t>
+      </w:r>
+    </w:p>
+    <w:p>
+      <w:pPr>
+        <w:spacing w:after="120"/>
+      </w:pPr>
+      <w:r>
+        <w:rPr/>
+        <w:t xml:space="preserve">The two versions of the app share the same Results page (role choice, scores, drawings, Print) and differ only in how results leave the device:</w:t>
+      </w:r>
+    </w:p>
+    <w:tbl>
+      <w:tblPr>
+        <w:tblW w:w="9360" w:type="dxa"/>
+        <w:tblLayout w:type="fixed"/>
+      </w:tblPr>
+      <w:tblGrid>
+        <w:gridCol w:w="4299"/>
+        <w:gridCol w:w="2496"/>
+        <w:gridCol w:w="2563"/>
+      </w:tblGrid>
+      <w:tr>
+        <w:trPr>
+          <w:tblHeader/>
+        </w:trPr>
+        <w:tc>
+          <w:tcPr>
+            <w:tcW w:type="dxa" w:w="4299"/>
+            <w:tcW w:w="4299" w:type="dxa"/>
+            <w:tcBorders>
+              <w:top w:val="single" w:color="C9D3DD" w:sz="4" w:space="0"/>
+              <w:left w:val="single" w:color="C9D3DD" w:sz="4" w:space="0"/>
+              <w:bottom w:val="single" w:color="C9D3DD" w:sz="4" w:space="0"/>
+              <w:right w:val="single" w:color="C9D3DD" w:sz="4" w:space="0"/>
+            </w:tcBorders>
+            <w:shd w:val="clear" w:color="auto" w:fill="1F3A5F"/>
+            <w:tcMar>
+              <w:top w:w="60" w:type="dxa"/>
+              <w:left w:w="100" w:type="dxa"/>
+              <w:bottom w:w="60" w:type="dxa"/>
+              <w:right w:w="100" w:type="dxa"/>
+            </w:tcMar>
+          </w:tcPr>
+          <w:p>
+            <w:r>
+              <w:rPr>
+                <w:b/>
+                <w:sz w:val="20"/>
+                <w:szCs w:val="20"/>
+                <w:color w:val="FFFFFF"/>
+              </w:rPr>
+              <w:t xml:space="preserve">On the Results page</w:t>
+            </w:r>
+          </w:p>
+        </w:tc>
+        <w:tc>
+          <w:tcPr>
+            <w:tcW w:type="dxa" w:w="2496"/>
+            <w:tcW w:w="2496" w:type="dxa"/>
+            <w:tcBorders>
+              <w:top w:val="single" w:color="C9D3DD" w:sz="4" w:space="0"/>
+              <w:left w:val="single" w:color="C9D3DD" w:sz="4" w:space="0"/>
+              <w:bottom w:val="single" w:color="C9D3DD" w:sz="4" w:space="0"/>
+              <w:right w:val="single" w:color="C9D3DD" w:sz="4" w:space="0"/>
+            </w:tcBorders>
+            <w:shd w:val="clear" w:color="auto" w:fill="1F3A5F"/>
+            <w:tcMar>
+              <w:top w:w="60" w:type="dxa"/>
+              <w:left w:w="100" w:type="dxa"/>
+              <w:bottom w:w="60" w:type="dxa"/>
+              <w:right w:w="100" w:type="dxa"/>
+            </w:tcMar>
+          </w:tcPr>
+          <w:p>
+            <w:r>
+              <w:rPr>
+                <w:b/>
+                <w:rFonts w:ascii="Consolas" w:hAnsi="Consolas" w:cs="Consolas"/>
+                <w:color w:val="FFFFFF"/>
+                <w:sz w:val="19"/>
+                <w:szCs w:val="19"/>
+              </w:rPr>
+              <w:t xml:space="preserve">main</w:t>
+            </w:r>
+            <w:r>
+              <w:rPr>
+                <w:b/>
+                <w:sz w:val="20"/>
+                <w:szCs w:val="20"/>
+                <w:color w:val="FFFFFF"/>
+              </w:rPr>
+              <w:t xml:space="preserve"> (standalone, option 1a)</w:t>
+            </w:r>
+          </w:p>
+        </w:tc>
+        <w:tc>
+          <w:tcPr>
+            <w:tcW w:type="dxa" w:w="2563"/>
+            <w:tcW w:w="2563" w:type="dxa"/>
+            <w:tcBorders>
+              <w:top w:val="single" w:color="C9D3DD" w:sz="4" w:space="0"/>
+              <w:left w:val="single" w:color="C9D3DD" w:sz="4" w:space="0"/>
+              <w:bottom w:val="single" w:color="C9D3DD" w:sz="4" w:space="0"/>
+              <w:right w:val="single" w:color="C9D3DD" w:sz="4" w:space="0"/>
+            </w:tcBorders>
+            <w:shd w:val="clear" w:color="auto" w:fill="1F3A5F"/>
+            <w:tcMar>
+              <w:top w:w="60" w:type="dxa"/>
+              <w:left w:w="100" w:type="dxa"/>
+              <w:bottom w:w="60" w:type="dxa"/>
+              <w:right w:w="100" w:type="dxa"/>
+            </w:tcMar>
+          </w:tcPr>
+          <w:p>
+            <w:r>
+              <w:rPr>
+                <w:b/>
+                <w:rFonts w:ascii="Consolas" w:hAnsi="Consolas" w:cs="Consolas"/>
+                <w:color w:val="FFFFFF"/>
+                <w:sz w:val="19"/>
+                <w:szCs w:val="19"/>
+              </w:rPr>
+              <w:t xml:space="preserve">redcap</w:t>
+            </w:r>
+            <w:r>
+              <w:rPr>
+                <w:b/>
+                <w:sz w:val="20"/>
+                <w:szCs w:val="20"/>
+                <w:color w:val="FFFFFF"/>
+              </w:rPr>
+              <w:t xml:space="preserve"> (study mode, option 2a)</w:t>
+            </w:r>
+          </w:p>
+        </w:tc>
+      </w:tr>
+      <w:tr>
+        <w:trPr>
+          <w:cantSplit/>
+        </w:trPr>
+        <w:tc>
+          <w:tcPr>
+            <w:tcW w:type="dxa" w:w="4299"/>
+            <w:tcW w:w="4299" w:type="dxa"/>
+            <w:tcBorders>
+              <w:top w:val="single" w:color="C9D3DD" w:sz="4" w:space="0"/>
+              <w:left w:val="single" w:color="C9D3DD" w:sz="4" w:space="0"/>
+              <w:bottom w:val="single" w:color="C9D3DD" w:sz="4" w:space="0"/>
+              <w:right w:val="single" w:color="C9D3DD" w:sz="4" w:space="0"/>
+            </w:tcBorders>
+            <w:shd w:val="clear" w:color="auto" w:fill="FFFFFF"/>
+            <w:tcMar>
+              <w:top w:w="60" w:type="dxa"/>
+              <w:left w:w="100" w:type="dxa"/>
+              <w:bottom w:w="60" w:type="dxa"/>
+              <w:right w:w="100" w:type="dxa"/>
+            </w:tcMar>
+          </w:tcPr>
+          <w:p>
+            <w:r>
+              <w:rPr>
+                <w:sz w:val="20"/>
+                <w:szCs w:val="20"/>
+              </w:rPr>
+              <w:t xml:space="preserve">Download Results (CSV)</w:t>
+            </w:r>
+          </w:p>
+        </w:tc>
+        <w:tc>
+          <w:tcPr>
+            <w:tcW w:type="dxa" w:w="2496"/>
+            <w:tcW w:w="2496" w:type="dxa"/>
+            <w:tcBorders>
+              <w:top w:val="single" w:color="C9D3DD" w:sz="4" w:space="0"/>
+              <w:left w:val="single" w:color="C9D3DD" w:sz="4" w:space="0"/>
+              <w:bottom w:val="single" w:color="C9D3DD" w:sz="4" w:space="0"/>
+              <w:right w:val="single" w:color="C9D3DD" w:sz="4" w:space="0"/>
+            </w:tcBorders>
+            <w:shd w:val="clear" w:color="auto" w:fill="FFFFFF"/>
+            <w:tcMar>
+              <w:top w:w="60" w:type="dxa"/>
+              <w:left w:w="100" w:type="dxa"/>
+              <w:bottom w:w="60" w:type="dxa"/>
+              <w:right w:w="100" w:type="dxa"/>
+            </w:tcMar>
+          </w:tcPr>
+          <w:p>
+            <w:r>
+              <w:rPr>
+                <w:sz w:val="20"/>
+                <w:szCs w:val="20"/>
+              </w:rPr>
+              <w:t xml:space="preserve">Patient and professional views</w:t>
+            </w:r>
+          </w:p>
+        </w:tc>
+        <w:tc>
+          <w:tcPr>
+            <w:tcW w:type="dxa" w:w="2563"/>
+            <w:tcW w:w="2563" w:type="dxa"/>
+            <w:tcBorders>
+              <w:top w:val="single" w:color="C9D3DD" w:sz="4" w:space="0"/>
+              <w:left w:val="single" w:color="C9D3DD" w:sz="4" w:space="0"/>
+              <w:bottom w:val="single" w:color="C9D3DD" w:sz="4" w:space="0"/>
+              <w:right w:val="single" w:color="C9D3DD" w:sz="4" w:space="0"/>
+            </w:tcBorders>
+            <w:shd w:val="clear" w:color="auto" w:fill="FFFFFF"/>
+            <w:tcMar>
+              <w:top w:w="60" w:type="dxa"/>
+              <w:left w:w="100" w:type="dxa"/>
+              <w:bottom w:w="60" w:type="dxa"/>
+              <w:right w:w="100" w:type="dxa"/>
+            </w:tcMar>
+          </w:tcPr>
+          <w:p>
+            <w:r>
+              <w:rPr>
+                <w:sz w:val="20"/>
+                <w:szCs w:val="20"/>
+              </w:rPr>
+              <w:t xml:space="preserve">Professional view only (PI decision)</w:t>
+            </w:r>
+          </w:p>
+        </w:tc>
+      </w:tr>
+      <w:tr>
+        <w:trPr>
+          <w:cantSplit/>
+        </w:trPr>
+        <w:tc>
+          <w:tcPr>
+            <w:tcW w:type="dxa" w:w="4299"/>
+            <w:tcW w:w="4299" w:type="dxa"/>
+            <w:tcBorders>
+              <w:top w:val="single" w:color="C9D3DD" w:sz="4" w:space="0"/>
+              <w:left w:val="single" w:color="C9D3DD" w:sz="4" w:space="0"/>
+              <w:bottom w:val="single" w:color="C9D3DD" w:sz="4" w:space="0"/>
+              <w:right w:val="single" w:color="C9D3DD" w:sz="4" w:space="0"/>
+            </w:tcBorders>
+            <w:shd w:val="clear" w:color="auto" w:fill="EEF3F7"/>
+            <w:tcMar>
+              <w:top w:w="60" w:type="dxa"/>
+              <w:left w:w="100" w:type="dxa"/>
+              <w:bottom w:w="60" w:type="dxa"/>
+              <w:right w:w="100" w:type="dxa"/>
+            </w:tcMar>
+          </w:tcPr>
+          <w:p>
+            <w:r>
+              <w:rPr>
+                <w:sz w:val="20"/>
+                <w:szCs w:val="20"/>
+              </w:rPr>
+              <w:t xml:space="preserve">Save the study record: participant ID, timepoint, ZIP of the REDCap import row and the four drawings</w:t>
+            </w:r>
+          </w:p>
+        </w:tc>
+        <w:tc>
+          <w:tcPr>
+            <w:tcW w:type="dxa" w:w="2496"/>
+            <w:tcW w:w="2496" w:type="dxa"/>
+            <w:tcBorders>
+              <w:top w:val="single" w:color="C9D3DD" w:sz="4" w:space="0"/>
+              <w:left w:val="single" w:color="C9D3DD" w:sz="4" w:space="0"/>
+              <w:bottom w:val="single" w:color="C9D3DD" w:sz="4" w:space="0"/>
+              <w:right w:val="single" w:color="C9D3DD" w:sz="4" w:space="0"/>
+            </w:tcBorders>
+            <w:shd w:val="clear" w:color="auto" w:fill="EEF3F7"/>
+            <w:tcMar>
+              <w:top w:w="60" w:type="dxa"/>
+              <w:left w:w="100" w:type="dxa"/>
+              <w:bottom w:w="60" w:type="dxa"/>
+              <w:right w:w="100" w:type="dxa"/>
+            </w:tcMar>
+          </w:tcPr>
+          <w:p>
+            <w:r>
+              <w:rPr>
+                <w:sz w:val="20"/>
+                <w:szCs w:val="20"/>
+              </w:rPr>
+              <w:t xml:space="preserve">Yes</w:t>
+            </w:r>
+          </w:p>
+        </w:tc>
+        <w:tc>
+          <w:tcPr>
+            <w:tcW w:type="dxa" w:w="2563"/>
+            <w:tcW w:w="2563" w:type="dxa"/>
+            <w:tcBorders>
+              <w:top w:val="single" w:color="C9D3DD" w:sz="4" w:space="0"/>
+              <w:left w:val="single" w:color="C9D3DD" w:sz="4" w:space="0"/>
+              <w:bottom w:val="single" w:color="C9D3DD" w:sz="4" w:space="0"/>
+              <w:right w:val="single" w:color="C9D3DD" w:sz="4" w:space="0"/>
+            </w:tcBorders>
+            <w:shd w:val="clear" w:color="auto" w:fill="EEF3F7"/>
+            <w:tcMar>
+              <w:top w:w="60" w:type="dxa"/>
+              <w:left w:w="100" w:type="dxa"/>
+              <w:bottom w:w="60" w:type="dxa"/>
+              <w:right w:w="100" w:type="dxa"/>
+            </w:tcMar>
+          </w:tcPr>
+          <w:p>
+            <w:r>
+              <w:rPr>
+                <w:sz w:val="20"/>
+                <w:szCs w:val="20"/>
+              </w:rPr>
+              <w:t xml:space="preserve">No</w:t>
+            </w:r>
+          </w:p>
+        </w:tc>
+      </w:tr>
+      <w:tr>
+        <w:trPr>
+          <w:cantSplit/>
+        </w:trPr>
+        <w:tc>
+          <w:tcPr>
+            <w:tcW w:type="dxa" w:w="4299"/>
+            <w:tcW w:w="4299" w:type="dxa"/>
+            <w:tcBorders>
+              <w:top w:val="single" w:color="C9D3DD" w:sz="4" w:space="0"/>
+              <w:left w:val="single" w:color="C9D3DD" w:sz="4" w:space="0"/>
+              <w:bottom w:val="single" w:color="C9D3DD" w:sz="4" w:space="0"/>
+              <w:right w:val="single" w:color="C9D3DD" w:sz="4" w:space="0"/>
+            </w:tcBorders>
+            <w:shd w:val="clear" w:color="auto" w:fill="FFFFFF"/>
+            <w:tcMar>
+              <w:top w:w="60" w:type="dxa"/>
+              <w:left w:w="100" w:type="dxa"/>
+              <w:bottom w:w="60" w:type="dxa"/>
+              <w:right w:w="100" w:type="dxa"/>
+            </w:tcMar>
+          </w:tcPr>
+          <w:p>
+            <w:r>
+              <w:rPr>
+                <w:sz w:val="20"/>
+                <w:szCs w:val="20"/>
+              </w:rPr>
+              <w:t xml:space="preserve">Finish and start next participant</w:t>
+            </w:r>
+          </w:p>
+        </w:tc>
+        <w:tc>
+          <w:tcPr>
+            <w:tcW w:type="dxa" w:w="2496"/>
+            <w:tcW w:w="2496" w:type="dxa"/>
+            <w:tcBorders>
+              <w:top w:val="single" w:color="C9D3DD" w:sz="4" w:space="0"/>
+              <w:left w:val="single" w:color="C9D3DD" w:sz="4" w:space="0"/>
+              <w:bottom w:val="single" w:color="C9D3DD" w:sz="4" w:space="0"/>
+              <w:right w:val="single" w:color="C9D3DD" w:sz="4" w:space="0"/>
+            </w:tcBorders>
+            <w:shd w:val="clear" w:color="auto" w:fill="FFFFFF"/>
+            <w:tcMar>
+              <w:top w:w="60" w:type="dxa"/>
+              <w:left w:w="100" w:type="dxa"/>
+              <w:bottom w:w="60" w:type="dxa"/>
+              <w:right w:w="100" w:type="dxa"/>
+            </w:tcMar>
+          </w:tcPr>
+          <w:p>
+            <w:r>
+              <w:rPr>
+                <w:sz w:val="20"/>
+                <w:szCs w:val="20"/>
+              </w:rPr>
+              <w:t xml:space="preserve">Yes</w:t>
+            </w:r>
+          </w:p>
+        </w:tc>
+        <w:tc>
+          <w:tcPr>
+            <w:tcW w:type="dxa" w:w="2563"/>
+            <w:tcW w:w="2563" w:type="dxa"/>
+            <w:tcBorders>
+              <w:top w:val="single" w:color="C9D3DD" w:sz="4" w:space="0"/>
+              <w:left w:val="single" w:color="C9D3DD" w:sz="4" w:space="0"/>
+              <w:bottom w:val="single" w:color="C9D3DD" w:sz="4" w:space="0"/>
+              <w:right w:val="single" w:color="C9D3DD" w:sz="4" w:space="0"/>
+            </w:tcBorders>
+            <w:shd w:val="clear" w:color="auto" w:fill="FFFFFF"/>
+            <w:tcMar>
+              <w:top w:w="60" w:type="dxa"/>
+              <w:left w:w="100" w:type="dxa"/>
+              <w:bottom w:w="60" w:type="dxa"/>
+              <w:right w:w="100" w:type="dxa"/>
+            </w:tcMar>
+          </w:tcPr>
+          <w:p>
+            <w:r>
+              <w:rPr>
+                <w:sz w:val="20"/>
+                <w:szCs w:val="20"/>
+              </w:rPr>
+              <w:t xml:space="preserve">No</w:t>
+            </w:r>
+          </w:p>
+        </w:tc>
+      </w:tr>
+      <w:tr>
+        <w:trPr>
+          <w:cantSplit/>
+        </w:trPr>
+        <w:tc>
+          <w:tcPr>
+            <w:tcW w:type="dxa" w:w="4299"/>
+            <w:tcW w:w="4299" w:type="dxa"/>
+            <w:tcBorders>
+              <w:top w:val="single" w:color="C9D3DD" w:sz="4" w:space="0"/>
+              <w:left w:val="single" w:color="C9D3DD" w:sz="4" w:space="0"/>
+              <w:bottom w:val="single" w:color="C9D3DD" w:sz="4" w:space="0"/>
+              <w:right w:val="single" w:color="C9D3DD" w:sz="4" w:space="0"/>
+            </w:tcBorders>
+            <w:shd w:val="clear" w:color="auto" w:fill="EEF3F7"/>
+            <w:tcMar>
+              <w:top w:w="60" w:type="dxa"/>
+              <w:left w:w="100" w:type="dxa"/>
+              <w:bottom w:w="60" w:type="dxa"/>
+              <w:right w:w="100" w:type="dxa"/>
+            </w:tcMar>
+          </w:tcPr>
+          <w:p>
+            <w:r>
+              <w:rPr>
+                <w:sz w:val="20"/>
+                <w:szCs w:val="20"/>
+              </w:rPr>
+              <w:t xml:space="preserve">Automatic submission to REDCap, with a status banner</w:t>
+            </w:r>
+          </w:p>
+        </w:tc>
+        <w:tc>
+          <w:tcPr>
+            <w:tcW w:type="dxa" w:w="2496"/>
+            <w:tcW w:w="2496" w:type="dxa"/>
+            <w:tcBorders>
+              <w:top w:val="single" w:color="C9D3DD" w:sz="4" w:space="0"/>
+              <w:left w:val="single" w:color="C9D3DD" w:sz="4" w:space="0"/>
+              <w:bottom w:val="single" w:color="C9D3DD" w:sz="4" w:space="0"/>
+              <w:right w:val="single" w:color="C9D3DD" w:sz="4" w:space="0"/>
+            </w:tcBorders>
+            <w:shd w:val="clear" w:color="auto" w:fill="EEF3F7"/>
+            <w:tcMar>
+              <w:top w:w="60" w:type="dxa"/>
+              <w:left w:w="100" w:type="dxa"/>
+              <w:bottom w:w="60" w:type="dxa"/>
+              <w:right w:w="100" w:type="dxa"/>
+            </w:tcMar>
+          </w:tcPr>
+          <w:p>
+            <w:r>
+              <w:rPr>
+                <w:sz w:val="20"/>
+                <w:szCs w:val="20"/>
+              </w:rPr>
+              <w:t xml:space="preserve">No</w:t>
+            </w:r>
+          </w:p>
+        </w:tc>
+        <w:tc>
+          <w:tcPr>
+            <w:tcW w:type="dxa" w:w="2563"/>
+            <w:tcW w:w="2563" w:type="dxa"/>
+            <w:tcBorders>
+              <w:top w:val="single" w:color="C9D3DD" w:sz="4" w:space="0"/>
+              <w:left w:val="single" w:color="C9D3DD" w:sz="4" w:space="0"/>
+              <w:bottom w:val="single" w:color="C9D3DD" w:sz="4" w:space="0"/>
+              <w:right w:val="single" w:color="C9D3DD" w:sz="4" w:space="0"/>
+            </w:tcBorders>
+            <w:shd w:val="clear" w:color="auto" w:fill="EEF3F7"/>
+            <w:tcMar>
+              <w:top w:w="60" w:type="dxa"/>
+              <w:left w:w="100" w:type="dxa"/>
+              <w:bottom w:w="60" w:type="dxa"/>
+              <w:right w:w="100" w:type="dxa"/>
+            </w:tcMar>
+          </w:tcPr>
+          <w:p>
+            <w:r>
+              <w:rPr>
+                <w:sz w:val="20"/>
+                <w:szCs w:val="20"/>
+              </w:rPr>
+              <w:t xml:space="preserve">Yes, when opened from a </w:t>
+            </w:r>
+            <w:r>
+              <w:rPr>
+                <w:rFonts w:ascii="Consolas" w:hAnsi="Consolas" w:cs="Consolas"/>
+                <w:color w:val="333333"/>
+                <w:sz w:val="19"/>
+                <w:szCs w:val="19"/>
+              </w:rPr>
+              <w:t xml:space="preserve">?k=</w:t>
+            </w:r>
+            <w:r>
+              <w:rPr>
+                <w:sz w:val="20"/>
+                <w:szCs w:val="20"/>
+              </w:rPr>
+              <w:t xml:space="preserve"> link</w:t>
+            </w:r>
+          </w:p>
+        </w:tc>
+      </w:tr>
+      <w:tr>
+        <w:trPr>
+          <w:cantSplit/>
+        </w:trPr>
+        <w:tc>
+          <w:tcPr>
+            <w:tcW w:type="dxa" w:w="4299"/>
+            <w:tcW w:w="4299" w:type="dxa"/>
+            <w:tcBorders>
+              <w:top w:val="single" w:color="C9D3DD" w:sz="4" w:space="0"/>
+              <w:left w:val="single" w:color="C9D3DD" w:sz="4" w:space="0"/>
+              <w:bottom w:val="single" w:color="C9D3DD" w:sz="4" w:space="0"/>
+              <w:right w:val="single" w:color="C9D3DD" w:sz="4" w:space="0"/>
+            </w:tcBorders>
+            <w:shd w:val="clear" w:color="auto" w:fill="FFFFFF"/>
+            <w:tcMar>
+              <w:top w:w="60" w:type="dxa"/>
+              <w:left w:w="100" w:type="dxa"/>
+              <w:bottom w:w="60" w:type="dxa"/>
+              <w:right w:w="100" w:type="dxa"/>
+            </w:tcMar>
+          </w:tcPr>
+          <w:p>
+            <w:r>
+              <w:rPr>
+                <w:sz w:val="20"/>
+                <w:szCs w:val="20"/>
+              </w:rPr>
+              <w:t xml:space="preserve">"Already submitted" notice for a closed timepoint</w:t>
+            </w:r>
+          </w:p>
+        </w:tc>
+        <w:tc>
+          <w:tcPr>
+            <w:tcW w:type="dxa" w:w="2496"/>
+            <w:tcW w:w="2496" w:type="dxa"/>
+            <w:tcBorders>
+              <w:top w:val="single" w:color="C9D3DD" w:sz="4" w:space="0"/>
+              <w:left w:val="single" w:color="C9D3DD" w:sz="4" w:space="0"/>
+              <w:bottom w:val="single" w:color="C9D3DD" w:sz="4" w:space="0"/>
+              <w:right w:val="single" w:color="C9D3DD" w:sz="4" w:space="0"/>
+            </w:tcBorders>
+            <w:shd w:val="clear" w:color="auto" w:fill="FFFFFF"/>
+            <w:tcMar>
+              <w:top w:w="60" w:type="dxa"/>
+              <w:left w:w="100" w:type="dxa"/>
+              <w:bottom w:w="60" w:type="dxa"/>
+              <w:right w:w="100" w:type="dxa"/>
+            </w:tcMar>
+          </w:tcPr>
+          <w:p>
+            <w:r>
+              <w:rPr>
+                <w:sz w:val="20"/>
+                <w:szCs w:val="20"/>
+              </w:rPr>
+              <w:t xml:space="preserve">No</w:t>
+            </w:r>
+          </w:p>
+        </w:tc>
+        <w:tc>
+          <w:tcPr>
+            <w:tcW w:type="dxa" w:w="2563"/>
+            <w:tcW w:w="2563" w:type="dxa"/>
+            <w:tcBorders>
+              <w:top w:val="single" w:color="C9D3DD" w:sz="4" w:space="0"/>
+              <w:left w:val="single" w:color="C9D3DD" w:sz="4" w:space="0"/>
+              <w:bottom w:val="single" w:color="C9D3DD" w:sz="4" w:space="0"/>
+              <w:right w:val="single" w:color="C9D3DD" w:sz="4" w:space="0"/>
+            </w:tcBorders>
+            <w:shd w:val="clear" w:color="auto" w:fill="FFFFFF"/>
+            <w:tcMar>
+              <w:top w:w="60" w:type="dxa"/>
+              <w:left w:w="100" w:type="dxa"/>
+              <w:bottom w:w="60" w:type="dxa"/>
+              <w:right w:w="100" w:type="dxa"/>
+            </w:tcMar>
+          </w:tcPr>
+          <w:p>
+            <w:r>
+              <w:rPr>
+                <w:sz w:val="20"/>
+                <w:szCs w:val="20"/>
+              </w:rPr>
+              <w:t xml:space="preserve">Yes</w:t>
+            </w:r>
+          </w:p>
+        </w:tc>
+      </w:tr>
+    </w:tbl>
+    <w:p>
+      <w:pPr>
+        <w:spacing w:before="0" w:after="60"/>
+      </w:pPr>
+    </w:p>
+    <w:p>
+      <w:pPr>
+        <w:spacing w:after="120"/>
+      </w:pPr>
+      <w:r>
+        <w:rPr/>
+        <w:t xml:space="preserve">Opened without a </w:t>
+      </w:r>
+      <w:r>
+        <w:rPr>
+          <w:rFonts w:ascii="Consolas" w:hAnsi="Consolas" w:cs="Consolas"/>
+          <w:color w:val="333333"/>
+          <w:sz w:val="19"/>
+          <w:szCs w:val="19"/>
+        </w:rPr>
+        <w:t xml:space="preserve">?k=</w:t>
+      </w:r>
+      <w:r>
+        <w:rPr/>
+        <w:t xml:space="preserve"> link, the </w:t>
+      </w:r>
+      <w:r>
+        <w:rPr>
+          <w:rFonts w:ascii="Consolas" w:hAnsi="Consolas" w:cs="Consolas"/>
+          <w:color w:val="333333"/>
+          <w:sz w:val="19"/>
+          <w:szCs w:val="19"/>
+        </w:rPr>
+        <w:t xml:space="preserve">redcap</w:t>
+      </w:r>
+      <w:r>
+        <w:rPr/>
+        <w:t xml:space="preserve"> version behaves like </w:t>
+      </w:r>
+      <w:r>
+        <w:rPr>
+          <w:rFonts w:ascii="Consolas" w:hAnsi="Consolas" w:cs="Consolas"/>
+          <w:color w:val="333333"/>
+          <w:sz w:val="19"/>
+          <w:szCs w:val="19"/>
+        </w:rPr>
+        <w:t xml:space="preserve">main</w:t>
+      </w:r>
+      <w:r>
+        <w:rPr/>
+        <w:t xml:space="preserve"> minus the study record panel: nothing is submitted.</w:t>
       </w:r>
     </w:p>
     <w:p>

</xml_diff>

<commit_message>
docs: fix title formatting leaking into edited overview sentences
Co-Authored-By: Claude Opus 5.5 <noreply@anthropic.com>
Claude-Session: https://claude.ai/code/session_01WvzECS9tkcDkGpWoZeB54Z
</commit_message>
<xml_diff>
--- a/docs/CTS_Design_Workflow_Overview.docx
+++ b/docs/CTS_Design_Workflow_Overview.docx
@@ -4859,9 +4859,6 @@
       <w:r>
         <w:rPr>
           <w:b/>
-          <w:color w:val="1F3A5F"/>
-          <w:sz w:val="46"/>
-          <w:szCs w:val="46"/>
         </w:rPr>
         <w:t xml:space="preserve">Print Results</w:t>
       </w:r>
@@ -4871,9 +4868,6 @@
       <w:r>
         <w:rPr>
           <w:b/>
-          <w:color w:val="1F3A5F"/>
-          <w:sz w:val="46"/>
-          <w:szCs w:val="46"/>
         </w:rPr>
         <w:t xml:space="preserve">Download Results (CSV)</w:t>
       </w:r>
@@ -12894,6 +12888,10 @@
               <w:t xml:space="preserve">hooks/useExport.js</w:t>
             </w:r>
             <w:r>
+              <w:rPr>
+                <w:sz w:val="20"/>
+                <w:szCs w:val="20"/>
+              </w:rPr>
               <w:t xml:space="preserve"> (field names), </w:t>
             </w:r>
             <w:r>
@@ -12906,6 +12904,10 @@
               <w:t xml:space="preserve">lib/redcapCoding.js</w:t>
             </w:r>
             <w:r>
+              <w:rPr>
+                <w:sz w:val="20"/>
+                <w:szCs w:val="20"/>
+              </w:rPr>
               <w:t xml:space="preserve"> (coding)</w:t>
             </w:r>
           </w:p>
@@ -13355,9 +13357,6 @@
       <w:r>
         <w:rPr>
           <w:b/>
-          <w:color w:val="1F3A5F"/>
-          <w:sz w:val="46"/>
-          <w:szCs w:val="46"/>
         </w:rPr>
         <w:t xml:space="preserve">Keep the two branches in step.</w:t>
       </w:r>

</xml_diff>